<commit_message>
fix(usp71): update pro_after_test to 08Sep26 skipping weekend and Labor Day
</commit_message>
<xml_diff>
--- a/scratch/Tables OOS-262098 Solyn LLC (E75000) - USP71.docx
+++ b/scratch/Tables OOS-262098 Solyn LLC (E75000) - USP71.docx
@@ -1787,7 +1787,7 @@
                 <w:szCs w:val="14"/>
                 <w:rFonts w:ascii="Times New Roman" w:hAnsi="Times New Roman" w:cs="Times New Roman"/>
               </w:rPr>
-              <w:t xml:space="preserve" w:space="preserve"> 05Sep26</w:t>
+              <w:t xml:space="preserve" w:space="preserve"> 08Sep26</w:t>
             </w:r>
             <w:r>
               <w:rPr>
@@ -3054,7 +3054,7 @@
                 <w:szCs w:val="14"/>
                 <w:rFonts w:ascii="Times New Roman" w:hAnsi="Times New Roman" w:cs="Times New Roman"/>
               </w:rPr>
-              <w:t xml:space="preserve" w:space="preserve"> 05Sep26</w:t>
+              <w:t xml:space="preserve" w:space="preserve"> 08Sep26</w:t>
             </w:r>
             <w:r>
               <w:rPr>
@@ -4300,7 +4300,7 @@
                 <w:szCs w:val="14"/>
                 <w:rFonts w:ascii="Times New Roman" w:hAnsi="Times New Roman" w:cs="Times New Roman"/>
               </w:rPr>
-              <w:t xml:space="preserve" w:space="preserve"> 05Sep26</w:t>
+              <w:t xml:space="preserve" w:space="preserve"> 08Sep26</w:t>
             </w:r>
             <w:r>
               <w:rPr>

</xml_diff>

<commit_message>
feat(usp71): update Table 1 with confirmed Microbacterium sp. PM5
</commit_message>
<xml_diff>
--- a/scratch/Tables OOS-262098 Solyn LLC (E75000) - USP71.docx
+++ b/scratch/Tables OOS-262098 Solyn LLC (E75000) - USP71.docx
@@ -466,9 +466,9 @@
                 <w:szCs w:val="14"/>
                 <w:rFonts w:ascii="Times New Roman" w:hAnsi="Times New Roman" w:cs="Times New Roman"/>
               </w:rPr>
-              <w:t xml:space="preserve">Pending</w:t>
+              <w:t xml:space="preserve">Microbacterium sp. PM5</w:t>
               <w:br/>
-              <w:t xml:space="preserve">(Gram (-) rods)</w:t>
+              <w:t xml:space="preserve">(Gram (+) rods)</w:t>
             </w:r>
           </w:p>
         </w:tc>

</xml_diff>

<commit_message>
feat(oos-262098): add Table 3 for 15Sep26 EM bracketing (AO BSC 1314) across standalone tables and official reports
</commit_message>
<xml_diff>
--- a/scratch/Tables OOS-262098 Solyn LLC (E75000) - USP71.docx
+++ b/scratch/Tables OOS-262098 Solyn LLC (E75000) - USP71.docx
@@ -5506,12 +5506,4178 @@
         </w:rPr>
       </w:pPr>
     </w:p>
+    <w:p>
+      <w:pPr>
+        <w:spacing w:before="0" w:after="0"/>
+      </w:pPr>
+      <w:r>
+        <w:br w:type="page"/>
+      </w:r>
+    </w:p>
+    <w:p>
+      <w:pPr>
+        <w:spacing w:before="0" w:after="160"/>
+        <w:rPr>
+          <w:rFonts w:ascii="Times New Roman" w:hAnsi="Times New Roman"/>
+          <w:bCs/>
+          <w:sz w:val="18"/>
+          <w:szCs w:val="18"/>
+          <w:u w:val="single"/>
+        </w:rPr>
+      </w:pPr>
+      <w:r>
+        <w:rPr>
+          <w:rFonts w:ascii="Times New Roman" w:hAnsi="Times New Roman"/>
+          <w:bCs/>
+          <w:sz w:val="18"/>
+          <w:szCs w:val="18"/>
+          <w:u w:val="single"/>
+        </w:rPr>
+        <w:t>Table 3: Environmental Monitoring from Processing Performed on 15Sep26</w:t>
+      </w:r>
+    </w:p>
     <w:sectPr>
       <w:pgSz w:w="12240" w:h="15840" w:code="1"/>
       <w:pgMar w:top="245" w:right="1440" w:bottom="720" w:left="1440" w:header="720" w:footer="720" w:gutter="0"/>
       <w:cols w:space="720"/>
       <w:docGrid w:linePitch="360"/>
     </w:sectPr>
+    <w:tbl>
+      <w:tblPr>
+        <w:tblW w:w="0" w:type="auto"/>
+        <w:tblLook w:val="04A0" w:firstRow="1" w:lastRow="0" w:firstColumn="1" w:lastColumn="0" w:noHBand="0" w:noVBand="1"/>
+      </w:tblPr>
+      <w:tblGrid>
+        <w:gridCol w:w="991"/>
+        <w:gridCol w:w="115"/>
+        <w:gridCol w:w="652"/>
+        <w:gridCol w:w="1129"/>
+        <w:gridCol w:w="999"/>
+        <w:gridCol w:w="41"/>
+        <w:gridCol w:w="670"/>
+        <w:gridCol w:w="29"/>
+        <w:gridCol w:w="1415"/>
+        <w:gridCol w:w="1413"/>
+        <w:gridCol w:w="1353"/>
+        <w:gridCol w:w="13"/>
+        <w:gridCol w:w="520"/>
+      </w:tblGrid>
+      <w:tr>
+        <w:trPr>
+          <w:trHeight w:val="300"/>
+          <w:trHeight w:val="220" w:hRule="atLeast"/>
+        </w:trPr>
+        <w:tc>
+          <w:tcPr>
+            <w:tcW w:w="837" w:type="dxa"/>
+            <w:tcBorders>
+              <w:top w:val="single" w:sz="8" w:space="0" w:color="auto"/>
+              <w:left w:val="single" w:sz="8" w:space="0" w:color="auto"/>
+              <w:bottom w:val="single" w:sz="8" w:space="0" w:color="auto"/>
+              <w:right w:val="single" w:sz="8" w:space="0" w:color="auto"/>
+            </w:tcBorders>
+            <w:shd w:val="clear" w:color="auto" w:fill="E8E8E8" w:themeFill="background2"/>
+            <w:tcMar>
+              <w:left w:w="108" w:type="dxa"/>
+              <w:right w:w="108" w:type="dxa"/>
+            </w:tcMar>
+            <w:vAlign w:val="center"/>
+          </w:tcPr>
+          <w:p>
+            <w:pPr>
+              <w:jc w:val="center"/>
+            </w:pPr>
+            <w:r>
+              <w:rPr>
+                <w:b/>
+                <w:bCs/>
+                <w:color w:val="000000" w:themeColor="text1"/>
+                <w:sz w:val="12"/>
+                <w:szCs w:val="12"/>
+                <w:rFonts w:ascii="Times New Roman" w:hAnsi="Times New Roman" w:cs="Times New Roman"/>
+              </w:rPr>
+              <w:t>Environmental Monitoring (EM) Sampling Site</w:t>
+            </w:r>
+          </w:p>
+        </w:tc>
+        <w:tc>
+          <w:tcPr>
+            <w:tcW w:w="698" w:type="dxa"/>
+            <w:gridSpan w:val="2"/>
+            <w:tcBorders>
+              <w:top w:val="single" w:sz="8" w:space="0" w:color="auto"/>
+              <w:left w:val="single" w:sz="8" w:space="0" w:color="auto"/>
+              <w:bottom w:val="single" w:sz="8" w:space="0" w:color="auto"/>
+              <w:right w:val="single" w:sz="8" w:space="0" w:color="auto"/>
+            </w:tcBorders>
+            <w:shd w:val="clear" w:color="auto" w:fill="E8E8E8" w:themeFill="background2"/>
+            <w:tcMar>
+              <w:left w:w="108" w:type="dxa"/>
+              <w:right w:w="108" w:type="dxa"/>
+            </w:tcMar>
+            <w:vAlign w:val="center"/>
+          </w:tcPr>
+          <w:p>
+            <w:pPr>
+              <w:jc w:val="center"/>
+            </w:pPr>
+            <w:r>
+              <w:rPr>
+                <w:b/>
+                <w:bCs/>
+                <w:color w:val="000000" w:themeColor="text1"/>
+                <w:sz w:val="12"/>
+                <w:szCs w:val="12"/>
+                <w:rFonts w:ascii="Times New Roman" w:hAnsi="Times New Roman" w:cs="Times New Roman"/>
+              </w:rPr>
+              <w:t>Frequency</w:t>
+            </w:r>
+          </w:p>
+        </w:tc>
+        <w:tc>
+          <w:tcPr>
+            <w:tcW w:w="1206" w:type="dxa"/>
+            <w:tcBorders>
+              <w:top w:val="single" w:sz="8" w:space="0" w:color="auto"/>
+              <w:left w:val="nil"/>
+              <w:bottom w:val="single" w:sz="8" w:space="0" w:color="auto"/>
+              <w:right w:val="single" w:sz="8" w:space="0" w:color="auto"/>
+            </w:tcBorders>
+            <w:shd w:val="clear" w:color="auto" w:fill="E8E8E8" w:themeFill="background2"/>
+            <w:tcMar>
+              <w:left w:w="108" w:type="dxa"/>
+              <w:right w:w="108" w:type="dxa"/>
+            </w:tcMar>
+            <w:vAlign w:val="center"/>
+          </w:tcPr>
+          <w:p>
+            <w:pPr>
+              <w:jc w:val="center"/>
+            </w:pPr>
+            <w:r>
+              <w:rPr>
+                <w:b/>
+                <w:bCs/>
+                <w:color w:val="000000" w:themeColor="text1"/>
+                <w:sz w:val="12"/>
+                <w:szCs w:val="12"/>
+                <w:rFonts w:ascii="Times New Roman" w:hAnsi="Times New Roman" w:cs="Times New Roman"/>
+              </w:rPr>
+              <w:t>Date (DDMMMYY)</w:t>
+            </w:r>
+          </w:p>
+        </w:tc>
+        <w:tc>
+          <w:tcPr>
+            <w:tcW w:w="1168" w:type="dxa"/>
+            <w:gridSpan w:val="2"/>
+            <w:tcBorders>
+              <w:top w:val="single" w:sz="8" w:space="0" w:color="auto"/>
+              <w:left w:val="single" w:sz="8" w:space="0" w:color="auto"/>
+              <w:bottom w:val="single" w:sz="8" w:space="0" w:color="auto"/>
+              <w:right w:val="single" w:sz="8" w:space="0" w:color="auto"/>
+            </w:tcBorders>
+            <w:shd w:val="clear" w:color="auto" w:fill="E8E8E8" w:themeFill="background2"/>
+            <w:tcMar>
+              <w:left w:w="108" w:type="dxa"/>
+              <w:right w:w="108" w:type="dxa"/>
+            </w:tcMar>
+            <w:vAlign w:val="center"/>
+          </w:tcPr>
+          <w:p>
+            <w:pPr>
+              <w:jc w:val="center"/>
+            </w:pPr>
+            <w:r>
+              <w:rPr>
+                <w:b/>
+                <w:bCs/>
+                <w:color w:val="000000" w:themeColor="text1"/>
+                <w:sz w:val="12"/>
+                <w:szCs w:val="12"/>
+                <w:rFonts w:ascii="Times New Roman" w:hAnsi="Times New Roman" w:cs="Times New Roman"/>
+              </w:rPr>
+              <w:t>Analyst (Initials)</w:t>
+            </w:r>
+          </w:p>
+        </w:tc>
+        <w:tc>
+          <w:tcPr>
+            <w:tcW w:w="581" w:type="dxa"/>
+            <w:tcBorders>
+              <w:top w:val="single" w:sz="8" w:space="0" w:color="auto"/>
+              <w:left w:val="nil"/>
+              <w:bottom w:val="single" w:sz="8" w:space="0" w:color="auto"/>
+              <w:right w:val="single" w:sz="8" w:space="0" w:color="auto"/>
+            </w:tcBorders>
+            <w:shd w:val="clear" w:color="auto" w:fill="E8E8E8" w:themeFill="background2"/>
+            <w:tcMar>
+              <w:left w:w="108" w:type="dxa"/>
+              <w:right w:w="108" w:type="dxa"/>
+            </w:tcMar>
+            <w:vAlign w:val="center"/>
+          </w:tcPr>
+          <w:p>
+            <w:pPr>
+              <w:jc w:val="center"/>
+            </w:pPr>
+            <w:r>
+              <w:rPr>
+                <w:b/>
+                <w:bCs/>
+                <w:color w:val="000000" w:themeColor="text1"/>
+                <w:sz w:val="12"/>
+                <w:szCs w:val="12"/>
+                <w:rFonts w:ascii="Times New Roman" w:hAnsi="Times New Roman" w:cs="Times New Roman"/>
+              </w:rPr>
+              <w:t>Day /Week(s)</w:t>
+            </w:r>
+          </w:p>
+        </w:tc>
+        <w:tc>
+          <w:tcPr>
+            <w:tcW w:w="1505" w:type="dxa"/>
+            <w:gridSpan w:val="2"/>
+            <w:tcBorders>
+              <w:top w:val="single" w:sz="8" w:space="0" w:color="auto"/>
+              <w:left w:val="single" w:sz="8" w:space="0" w:color="auto"/>
+              <w:bottom w:val="single" w:sz="8" w:space="0" w:color="auto"/>
+              <w:right w:val="single" w:sz="8" w:space="0" w:color="auto"/>
+            </w:tcBorders>
+            <w:shd w:val="clear" w:color="auto" w:fill="E8E8E8" w:themeFill="background2"/>
+            <w:tcMar>
+              <w:left w:w="108" w:type="dxa"/>
+              <w:right w:w="108" w:type="dxa"/>
+            </w:tcMar>
+            <w:vAlign w:val="center"/>
+          </w:tcPr>
+          <w:p>
+            <w:pPr>
+              <w:jc w:val="center"/>
+            </w:pPr>
+            <w:r>
+              <w:rPr>
+                <w:b/>
+                <w:bCs/>
+                <w:color w:val="000000" w:themeColor="text1"/>
+                <w:sz w:val="12"/>
+                <w:szCs w:val="12"/>
+                <w:rFonts w:ascii="Times New Roman" w:hAnsi="Times New Roman" w:cs="Times New Roman"/>
+              </w:rPr>
+              <w:t>Observation*</w:t>
+            </w:r>
+          </w:p>
+        </w:tc>
+        <w:tc>
+          <w:tcPr>
+            <w:tcW w:w="1444" w:type="dxa"/>
+            <w:tcBorders>
+              <w:top w:val="single" w:sz="8" w:space="0" w:color="auto"/>
+              <w:left w:val="nil"/>
+              <w:bottom w:val="single" w:sz="8" w:space="0" w:color="auto"/>
+              <w:right w:val="single" w:sz="8" w:space="0" w:color="auto"/>
+            </w:tcBorders>
+            <w:shd w:val="clear" w:color="auto" w:fill="E8E8E8" w:themeFill="background2"/>
+            <w:tcMar>
+              <w:left w:w="108" w:type="dxa"/>
+              <w:right w:w="108" w:type="dxa"/>
+            </w:tcMar>
+            <w:vAlign w:val="center"/>
+          </w:tcPr>
+          <w:p>
+            <w:pPr>
+              <w:jc w:val="center"/>
+            </w:pPr>
+            <w:r>
+              <w:rPr>
+                <w:b/>
+                <w:bCs/>
+                <w:color w:val="000000" w:themeColor="text1"/>
+                <w:sz w:val="12"/>
+                <w:szCs w:val="12"/>
+                <w:rFonts w:ascii="Times New Roman" w:hAnsi="Times New Roman" w:cs="Times New Roman"/>
+              </w:rPr>
+              <w:t>Environmental Monitoring Plate ETX ID</w:t>
+            </w:r>
+          </w:p>
+        </w:tc>
+        <w:tc>
+          <w:tcPr>
+            <w:tcW w:w="1394" w:type="dxa"/>
+            <w:tcBorders>
+              <w:top w:val="single" w:sz="8" w:space="0" w:color="auto"/>
+              <w:left w:val="single" w:sz="8" w:space="0" w:color="auto"/>
+              <w:bottom w:val="single" w:sz="8" w:space="0" w:color="auto"/>
+              <w:right w:val="single" w:sz="8" w:space="0" w:color="auto"/>
+            </w:tcBorders>
+            <w:shd w:val="clear" w:color="auto" w:fill="E8E8E8" w:themeFill="background2"/>
+            <w:tcMar>
+              <w:left w:w="108" w:type="dxa"/>
+              <w:right w:w="108" w:type="dxa"/>
+            </w:tcMar>
+            <w:vAlign w:val="center"/>
+          </w:tcPr>
+          <w:p>
+            <w:pPr>
+              <w:jc w:val="center"/>
+            </w:pPr>
+            <w:r>
+              <w:rPr>
+                <w:b/>
+                <w:bCs/>
+                <w:color w:val="000000" w:themeColor="text1"/>
+                <w:sz w:val="12"/>
+                <w:szCs w:val="12"/>
+                <w:rFonts w:ascii="Times New Roman" w:hAnsi="Times New Roman" w:cs="Times New Roman"/>
+              </w:rPr>
+              <w:t>Microbial ID</w:t>
+            </w:r>
+          </w:p>
+        </w:tc>
+        <w:tc>
+          <w:tcPr>
+            <w:tcW w:w="507" w:type="dxa"/>
+            <w:gridSpan w:val="2"/>
+            <w:tcBorders>
+              <w:top w:val="single" w:sz="8" w:space="0" w:color="auto"/>
+              <w:left w:val="single" w:sz="8" w:space="0" w:color="auto"/>
+              <w:bottom w:val="single" w:sz="8" w:space="0" w:color="auto"/>
+              <w:right w:val="single" w:sz="8" w:space="0" w:color="auto"/>
+            </w:tcBorders>
+            <w:shd w:val="clear" w:color="auto" w:fill="E8E8E8" w:themeFill="background2"/>
+            <w:tcMar>
+              <w:left w:w="108" w:type="dxa"/>
+              <w:right w:w="108" w:type="dxa"/>
+            </w:tcMar>
+            <w:vAlign w:val="center"/>
+          </w:tcPr>
+          <w:p>
+            <w:pPr>
+              <w:jc w:val="center"/>
+            </w:pPr>
+            <w:r>
+              <w:rPr>
+                <w:b/>
+                <w:bCs/>
+                <w:color w:val="000000" w:themeColor="text1"/>
+                <w:sz w:val="12"/>
+                <w:szCs w:val="12"/>
+                <w:rFonts w:ascii="Times New Roman" w:hAnsi="Times New Roman" w:cs="Times New Roman"/>
+              </w:rPr>
+              <w:t xml:space="preserve">Notes </w:t>
+            </w:r>
+          </w:p>
+        </w:tc>
+      </w:tr>
+      <w:tr>
+        <w:trPr>
+          <w:trHeight w:val="300"/>
+          <w:trHeight w:val="220" w:hRule="atLeast"/>
+        </w:trPr>
+        <w:tc>
+          <w:tcPr>
+            <w:tcW w:w="9340" w:type="dxa"/>
+            <w:gridSpan w:val="13"/>
+            <w:tcBorders>
+              <w:top w:val="single" w:sz="8" w:space="0" w:color="auto"/>
+              <w:left w:val="single" w:sz="8" w:space="0" w:color="auto"/>
+              <w:bottom w:val="single" w:sz="8" w:space="0" w:color="auto"/>
+              <w:right w:val="single" w:sz="8" w:space="0" w:color="000000" w:themeColor="text1"/>
+            </w:tcBorders>
+            <w:shd w:val="clear" w:color="auto" w:fill="D9D9D9" w:themeFill="background1" w:themeFillShade="D9"/>
+            <w:tcMar>
+              <w:left w:w="108" w:type="dxa"/>
+              <w:right w:w="108" w:type="dxa"/>
+            </w:tcMar>
+            <w:vAlign w:val="center"/>
+          </w:tcPr>
+          <w:p>
+            <w:r>
+              <w:rPr>
+                <w:b/>
+                <w:bCs/>
+                <w:color w:val="000000" w:themeColor="text1"/>
+                <w:sz w:val="14"/>
+                <w:szCs w:val="14"/>
+                <w:rFonts w:ascii="Times New Roman" w:hAnsi="Times New Roman" w:cs="Times New Roman"/>
+              </w:rPr>
+              <w:t xml:space="preserve"> Personnel EM Bracketing</w:t>
+            </w:r>
+          </w:p>
+        </w:tc>
+      </w:tr>
+      <w:tr>
+        <w:trPr>
+          <w:trHeight w:val="300"/>
+          <w:trHeight w:val="220" w:hRule="atLeast"/>
+        </w:trPr>
+        <w:tc>
+          <w:tcPr>
+            <w:tcW w:w="837" w:type="dxa"/>
+            <w:tcBorders>
+              <w:top w:val="single" w:sz="8" w:space="0" w:color="auto"/>
+              <w:left w:val="single" w:sz="8" w:space="0" w:color="auto"/>
+              <w:bottom w:val="single" w:sz="8" w:space="0" w:color="auto"/>
+              <w:right w:val="single" w:sz="8" w:space="0" w:color="000000" w:themeColor="text1"/>
+            </w:tcBorders>
+            <w:shd w:val="clear" w:color="auto" w:fill="FFFFFF" w:themeFill="background1"/>
+            <w:tcMar>
+              <w:left w:w="108" w:type="dxa"/>
+              <w:right w:w="108" w:type="dxa"/>
+            </w:tcMar>
+            <w:vAlign w:val="center"/>
+          </w:tcPr>
+          <w:p>
+            <w:pPr>
+              <w:jc w:val="center"/>
+            </w:pPr>
+            <w:r>
+              <w:rPr>
+                <w:color w:val="000000" w:themeColor="text1"/>
+                <w:sz w:val="14"/>
+                <w:szCs w:val="14"/>
+                <w:rFonts w:ascii="Times New Roman" w:hAnsi="Times New Roman" w:cs="Times New Roman"/>
+              </w:rPr>
+              <w:t>Personnel (Left Touch and Right Touch)</w:t>
+            </w:r>
+          </w:p>
+        </w:tc>
+        <w:tc>
+          <w:tcPr>
+            <w:tcW w:w="698" w:type="dxa"/>
+            <w:gridSpan w:val="2"/>
+            <w:tcBorders>
+              <w:top w:val="nil"/>
+              <w:left w:val="single" w:sz="8" w:space="0" w:color="auto"/>
+              <w:bottom w:val="single" w:sz="8" w:space="0" w:color="auto"/>
+              <w:right w:val="single" w:sz="8" w:space="0" w:color="auto"/>
+            </w:tcBorders>
+            <w:shd w:val="clear" w:color="auto" w:fill="FFFFFF" w:themeFill="background1"/>
+            <w:tcMar>
+              <w:left w:w="108" w:type="dxa"/>
+              <w:right w:w="108" w:type="dxa"/>
+            </w:tcMar>
+            <w:vAlign w:val="center"/>
+          </w:tcPr>
+          <w:p>
+            <w:pPr>
+              <w:jc w:val="center"/>
+            </w:pPr>
+            <w:r>
+              <w:rPr>
+                <w:color w:val="000000" w:themeColor="text1"/>
+                <w:sz w:val="14"/>
+                <w:szCs w:val="14"/>
+                <w:rFonts w:ascii="Times New Roman" w:hAnsi="Times New Roman" w:cs="Times New Roman"/>
+              </w:rPr>
+              <w:t xml:space="preserve">Daily</w:t>
+            </w:r>
+          </w:p>
+        </w:tc>
+        <w:tc>
+          <w:tcPr>
+            <w:tcW w:w="1206" w:type="dxa"/>
+            <w:tcBorders>
+              <w:top w:val="nil"/>
+              <w:left w:val="nil"/>
+              <w:bottom w:val="single" w:sz="8" w:space="0" w:color="auto"/>
+              <w:right w:val="single" w:sz="8" w:space="0" w:color="auto"/>
+            </w:tcBorders>
+            <w:shd w:val="clear" w:color="auto" w:fill="FFFFFF" w:themeFill="background1"/>
+            <w:tcMar>
+              <w:left w:w="108" w:type="dxa"/>
+              <w:right w:w="108" w:type="dxa"/>
+            </w:tcMar>
+            <w:vAlign w:val="center"/>
+          </w:tcPr>
+          <w:p>
+            <w:pPr>
+              <w:jc w:val="center"/>
+              <w:spacing w:before="0" w:after="0" w:line="240" w:lineRule="auto"/>
+              <w:rPr>
+                <w:rFonts w:ascii="Times New Roman" w:hAnsi="Times New Roman"/>
+                <w:sz w:val="14"/>
+                <w:szCs w:val="14"/>
+              </w:rPr>
+            </w:pPr>
+            <w:r>
+              <w:rPr>
+                <w:sz w:val="14"/>
+                <w:szCs w:val="14"/>
+                <w:rFonts w:ascii="Times New Roman" w:hAnsi="Times New Roman" w:cs="Times New Roman"/>
+              </w:rPr>
+              <w:t>10Sep26</w:t>
+            </w:r>
+          </w:p>
+        </w:tc>
+        <w:tc>
+          <w:tcPr>
+            <w:tcW w:w="1168" w:type="dxa"/>
+            <w:gridSpan w:val="2"/>
+            <w:tcBorders>
+              <w:top w:val="nil"/>
+              <w:left w:val="single" w:sz="8" w:space="0" w:color="auto"/>
+              <w:bottom w:val="single" w:sz="8" w:space="0" w:color="auto"/>
+              <w:right w:val="single" w:sz="8" w:space="0" w:color="auto"/>
+            </w:tcBorders>
+            <w:shd w:val="clear" w:color="auto" w:fill="FFFFFF" w:themeFill="background1"/>
+            <w:tcMar>
+              <w:left w:w="108" w:type="dxa"/>
+              <w:right w:w="108" w:type="dxa"/>
+            </w:tcMar>
+            <w:vAlign w:val="center"/>
+          </w:tcPr>
+          <w:p>
+            <w:pPr>
+              <w:jc w:val="center"/>
+              <w:spacing w:before="0" w:after="0" w:line="240" w:lineRule="auto"/>
+              <w:rPr>
+                <w:rFonts w:ascii="Times New Roman" w:hAnsi="Times New Roman"/>
+                <w:sz w:val="14"/>
+                <w:szCs w:val="14"/>
+              </w:rPr>
+            </w:pPr>
+            <w:r>
+              <w:rPr>
+                <w:sz w:val="14"/>
+                <w:szCs w:val="14"/>
+                <w:rFonts w:ascii="Times New Roman" w:hAnsi="Times New Roman" w:cs="Times New Roman"/>
+              </w:rPr>
+              <w:t>AO</w:t>
+            </w:r>
+          </w:p>
+        </w:tc>
+        <w:tc>
+          <w:tcPr>
+            <w:tcW w:w="581" w:type="dxa"/>
+            <w:tcBorders>
+              <w:top w:val="nil"/>
+              <w:left w:val="nil"/>
+              <w:bottom w:val="single" w:sz="8" w:space="0" w:color="auto"/>
+              <w:right w:val="single" w:sz="8" w:space="0" w:color="auto"/>
+            </w:tcBorders>
+            <w:shd w:val="clear" w:color="auto" w:fill="FFFFFF" w:themeFill="background1"/>
+            <w:tcMar>
+              <w:left w:w="108" w:type="dxa"/>
+              <w:right w:w="108" w:type="dxa"/>
+            </w:tcMar>
+            <w:vAlign w:val="center"/>
+          </w:tcPr>
+          <w:p>
+            <w:pPr>
+              <w:jc w:val="center"/>
+            </w:pPr>
+            <w:r>
+              <w:rPr>
+                <w:color w:val="000000" w:themeColor="text1"/>
+                <w:sz w:val="14"/>
+                <w:szCs w:val="14"/>
+                <w:rFonts w:ascii="Times New Roman" w:hAnsi="Times New Roman" w:cs="Times New Roman"/>
+              </w:rPr>
+              <w:t xml:space="preserve">Date Before Testing</w:t>
+            </w:r>
+          </w:p>
+        </w:tc>
+        <w:tc>
+          <w:tcPr>
+            <w:tcW w:w="1505" w:type="dxa"/>
+            <w:gridSpan w:val="2"/>
+            <w:tcBorders>
+              <w:top w:val="nil"/>
+              <w:left w:val="single" w:sz="8" w:space="0" w:color="auto"/>
+              <w:bottom w:val="single" w:sz="8" w:space="0" w:color="auto"/>
+              <w:right w:val="single" w:sz="8" w:space="0" w:color="auto"/>
+            </w:tcBorders>
+            <w:shd w:val="clear" w:color="auto" w:fill="FFFFFF" w:themeFill="background1"/>
+            <w:tcMar>
+              <w:left w:w="108" w:type="dxa"/>
+              <w:right w:w="108" w:type="dxa"/>
+            </w:tcMar>
+            <w:vAlign w:val="center"/>
+          </w:tcPr>
+          <w:p>
+            <w:pPr>
+              <w:jc w:val="center"/>
+              <w:spacing w:before="0" w:after="0" w:line="240" w:lineRule="auto"/>
+              <w:rPr>
+                <w:rFonts w:ascii="Times New Roman" w:hAnsi="Times New Roman"/>
+                <w:sz w:val="14"/>
+                <w:szCs w:val="14"/>
+              </w:rPr>
+            </w:pPr>
+            <w:r>
+              <w:rPr>
+                <w:sz w:val="14"/>
+                <w:szCs w:val="14"/>
+                <w:rFonts w:ascii="Times New Roman" w:hAnsi="Times New Roman" w:cs="Times New Roman"/>
+              </w:rPr>
+              <w:t>No growth</w:t>
+            </w:r>
+          </w:p>
+        </w:tc>
+        <w:tc>
+          <w:tcPr>
+            <w:tcW w:w="1444" w:type="dxa"/>
+            <w:tcBorders>
+              <w:top w:val="nil"/>
+              <w:left w:val="nil"/>
+              <w:bottom w:val="single" w:sz="8" w:space="0" w:color="auto"/>
+              <w:right w:val="single" w:sz="8" w:space="0" w:color="auto"/>
+            </w:tcBorders>
+            <w:shd w:val="clear" w:color="auto" w:fill="FFFFFF" w:themeFill="background1"/>
+            <w:tcMar>
+              <w:left w:w="108" w:type="dxa"/>
+              <w:right w:w="108" w:type="dxa"/>
+            </w:tcMar>
+            <w:vAlign w:val="center"/>
+          </w:tcPr>
+          <w:p>
+            <w:pPr>
+              <w:jc w:val="center"/>
+              <w:spacing w:before="0" w:after="0" w:line="240" w:lineRule="auto"/>
+              <w:rPr>
+                <w:rFonts w:ascii="Times New Roman" w:hAnsi="Times New Roman"/>
+                <w:sz w:val="14"/>
+                <w:szCs w:val="14"/>
+              </w:rPr>
+            </w:pPr>
+            <w:r>
+              <w:rPr>
+                <w:sz w:val="14"/>
+                <w:szCs w:val="14"/>
+                <w:rFonts w:ascii="Times New Roman" w:hAnsi="Times New Roman" w:cs="Times New Roman"/>
+              </w:rPr>
+              <w:t>N/A</w:t>
+            </w:r>
+          </w:p>
+        </w:tc>
+        <w:tc>
+          <w:tcPr>
+            <w:tcW w:w="1394" w:type="dxa"/>
+            <w:tcBorders>
+              <w:top w:val="nil"/>
+              <w:left w:val="single" w:sz="8" w:space="0" w:color="auto"/>
+              <w:bottom w:val="single" w:sz="8" w:space="0" w:color="auto"/>
+              <w:right w:val="single" w:sz="8" w:space="0" w:color="auto"/>
+            </w:tcBorders>
+            <w:shd w:val="clear" w:color="auto" w:fill="FFFFFF" w:themeFill="background1"/>
+            <w:tcMar>
+              <w:left w:w="108" w:type="dxa"/>
+              <w:right w:w="108" w:type="dxa"/>
+            </w:tcMar>
+            <w:vAlign w:val="center"/>
+          </w:tcPr>
+          <w:p>
+            <w:r>
+              <w:rPr>
+                <w:color w:val="000000" w:themeColor="text1"/>
+                <w:sz w:val="14"/>
+                <w:szCs w:val="14"/>
+                <w:rFonts w:ascii="Times New Roman" w:hAnsi="Times New Roman" w:cs="Times New Roman"/>
+              </w:rPr>
+              <w:t xml:space="preserve" w:space="preserve">N/A</w:t>
+            </w:r>
+            <w:r>
+              <w:rPr>
+                <w:color w:val="000000" w:themeColor="text1"/>
+                <w:sz w:val="14"/>
+                <w:szCs w:val="14"/>
+                <w:rFonts w:ascii="Times New Roman" w:hAnsi="Times New Roman" w:cs="Times New Roman"/>
+              </w:rPr>
+              <w:t/>
+            </w:r>
+            <w:r>
+              <w:rPr>
+                <w:color w:val="000000" w:themeColor="text1"/>
+                <w:sz w:val="14"/>
+                <w:szCs w:val="14"/>
+                <w:rFonts w:ascii="Times New Roman" w:hAnsi="Times New Roman" w:cs="Times New Roman"/>
+              </w:rPr>
+              <w:t/>
+            </w:r>
+            <w:r>
+              <w:rPr>
+                <w:color w:val="000000" w:themeColor="text1"/>
+                <w:sz w:val="14"/>
+                <w:szCs w:val="14"/>
+                <w:rFonts w:ascii="Times New Roman" w:hAnsi="Times New Roman" w:cs="Times New Roman"/>
+              </w:rPr>
+              <w:t/>
+            </w:r>
+            <w:r>
+              <w:rPr>
+                <w:color w:val="000000" w:themeColor="text1"/>
+                <w:sz w:val="14"/>
+                <w:szCs w:val="14"/>
+                <w:rFonts w:ascii="Times New Roman" w:hAnsi="Times New Roman" w:cs="Times New Roman"/>
+              </w:rPr>
+              <w:t xml:space="preserve"/>
+            </w:r>
+          </w:p>
+        </w:tc>
+        <w:tc>
+          <w:tcPr>
+            <w:tcW w:w="507" w:type="dxa"/>
+            <w:gridSpan w:val="2"/>
+            <w:tcBorders>
+              <w:top w:val="nil"/>
+              <w:left w:val="single" w:sz="8" w:space="0" w:color="auto"/>
+              <w:bottom w:val="single" w:sz="8" w:space="0" w:color="auto"/>
+              <w:right w:val="single" w:sz="8" w:space="0" w:color="auto"/>
+            </w:tcBorders>
+            <w:shd w:val="clear" w:color="auto" w:fill="FFFFFF" w:themeFill="background1"/>
+            <w:tcMar>
+              <w:left w:w="108" w:type="dxa"/>
+              <w:right w:w="108" w:type="dxa"/>
+            </w:tcMar>
+            <w:vAlign w:val="center"/>
+          </w:tcPr>
+          <w:p>
+            <w:pPr>
+              <w:jc w:val="center"/>
+              <w:spacing w:before="0" w:after="0" w:line="240" w:lineRule="auto"/>
+              <w:rPr>
+                <w:rFonts w:ascii="Times New Roman" w:hAnsi="Times New Roman"/>
+                <w:sz w:val="14"/>
+                <w:szCs w:val="14"/>
+              </w:rPr>
+            </w:pPr>
+            <w:r>
+              <w:rPr>
+                <w:sz w:val="14"/>
+                <w:szCs w:val="14"/>
+                <w:rFonts w:ascii="Times New Roman" w:hAnsi="Times New Roman" w:cs="Times New Roman"/>
+              </w:rPr>
+              <w:t>None</w:t>
+            </w:r>
+          </w:p>
+        </w:tc>
+      </w:tr>
+      <w:tr>
+        <w:trPr>
+          <w:trHeight w:val="300"/>
+          <w:trHeight w:val="220" w:hRule="atLeast"/>
+        </w:trPr>
+        <w:tc>
+          <w:tcPr>
+            <w:tcW w:w="837" w:type="dxa"/>
+            <w:tcBorders>
+              <w:top w:val="single" w:sz="8" w:space="0" w:color="auto"/>
+              <w:left w:val="single" w:sz="8" w:space="0" w:color="auto"/>
+              <w:bottom w:val="single" w:sz="8" w:space="0" w:color="auto"/>
+              <w:right w:val="single" w:sz="8" w:space="0" w:color="auto"/>
+            </w:tcBorders>
+            <w:shd w:val="clear" w:color="auto" w:fill="FFFFFF" w:themeFill="background1"/>
+            <w:tcMar>
+              <w:left w:w="108" w:type="dxa"/>
+              <w:right w:w="108" w:type="dxa"/>
+            </w:tcMar>
+            <w:vAlign w:val="center"/>
+          </w:tcPr>
+          <w:p>
+            <w:pPr>
+              <w:jc w:val="center"/>
+            </w:pPr>
+            <w:r>
+              <w:rPr>
+                <w:color w:val="000000" w:themeColor="text1"/>
+                <w:sz w:val="14"/>
+                <w:szCs w:val="14"/>
+                <w:rFonts w:ascii="Times New Roman" w:hAnsi="Times New Roman" w:cs="Times New Roman"/>
+              </w:rPr>
+              <w:t>Personnel (Left Touch and Right Touch)</w:t>
+            </w:r>
+          </w:p>
+        </w:tc>
+        <w:tc>
+          <w:tcPr>
+            <w:tcW w:w="698" w:type="dxa"/>
+            <w:gridSpan w:val="2"/>
+            <w:tcBorders>
+              <w:top w:val="single" w:sz="8" w:space="0" w:color="auto"/>
+              <w:left w:val="single" w:sz="8" w:space="0" w:color="auto"/>
+              <w:bottom w:val="single" w:sz="8" w:space="0" w:color="auto"/>
+              <w:right w:val="single" w:sz="8" w:space="0" w:color="auto"/>
+            </w:tcBorders>
+            <w:shd w:val="clear" w:color="auto" w:fill="FFFFFF" w:themeFill="background1"/>
+            <w:tcMar>
+              <w:left w:w="108" w:type="dxa"/>
+              <w:right w:w="108" w:type="dxa"/>
+            </w:tcMar>
+            <w:vAlign w:val="center"/>
+          </w:tcPr>
+          <w:p>
+            <w:pPr>
+              <w:jc w:val="center"/>
+            </w:pPr>
+            <w:r>
+              <w:rPr>
+                <w:color w:val="000000" w:themeColor="text1"/>
+                <w:sz w:val="14"/>
+                <w:szCs w:val="14"/>
+                <w:rFonts w:ascii="Times New Roman" w:hAnsi="Times New Roman" w:cs="Times New Roman"/>
+              </w:rPr>
+              <w:t xml:space="preserve">Daily</w:t>
+            </w:r>
+          </w:p>
+        </w:tc>
+        <w:tc>
+          <w:tcPr>
+            <w:tcW w:w="1206" w:type="dxa"/>
+            <w:tcBorders>
+              <w:top w:val="single" w:sz="8" w:space="0" w:color="auto"/>
+              <w:left w:val="nil"/>
+              <w:bottom w:val="single" w:sz="8" w:space="0" w:color="auto"/>
+              <w:right w:val="single" w:sz="8" w:space="0" w:color="auto"/>
+            </w:tcBorders>
+            <w:shd w:val="clear" w:color="auto" w:fill="FFFFFF" w:themeFill="background1"/>
+            <w:tcMar>
+              <w:left w:w="108" w:type="dxa"/>
+              <w:right w:w="108" w:type="dxa"/>
+            </w:tcMar>
+            <w:vAlign w:val="center"/>
+          </w:tcPr>
+          <w:p>
+            <w:pPr>
+              <w:jc w:val="center"/>
+              <w:spacing w:before="0" w:after="0" w:line="240" w:lineRule="auto"/>
+              <w:rPr>
+                <w:rFonts w:ascii="Times New Roman" w:hAnsi="Times New Roman"/>
+                <w:sz w:val="14"/>
+                <w:szCs w:val="14"/>
+              </w:rPr>
+            </w:pPr>
+            <w:r>
+              <w:rPr>
+                <w:sz w:val="14"/>
+                <w:szCs w:val="14"/>
+                <w:rFonts w:ascii="Times New Roman" w:hAnsi="Times New Roman" w:cs="Times New Roman"/>
+              </w:rPr>
+              <w:t>15Sep26</w:t>
+            </w:r>
+          </w:p>
+        </w:tc>
+        <w:tc>
+          <w:tcPr>
+            <w:tcW w:w="1168" w:type="dxa"/>
+            <w:gridSpan w:val="2"/>
+            <w:tcBorders>
+              <w:top w:val="single" w:sz="8" w:space="0" w:color="auto"/>
+              <w:left w:val="single" w:sz="8" w:space="0" w:color="auto"/>
+              <w:bottom w:val="single" w:sz="8" w:space="0" w:color="auto"/>
+              <w:right w:val="single" w:sz="8" w:space="0" w:color="auto"/>
+            </w:tcBorders>
+            <w:shd w:val="clear" w:color="auto" w:fill="FFFFFF" w:themeFill="background1"/>
+            <w:tcMar>
+              <w:left w:w="108" w:type="dxa"/>
+              <w:right w:w="108" w:type="dxa"/>
+            </w:tcMar>
+            <w:vAlign w:val="center"/>
+          </w:tcPr>
+          <w:p>
+            <w:pPr>
+              <w:jc w:val="center"/>
+              <w:spacing w:before="0" w:after="0" w:line="240" w:lineRule="auto"/>
+              <w:rPr>
+                <w:rFonts w:ascii="Times New Roman" w:hAnsi="Times New Roman"/>
+                <w:sz w:val="14"/>
+                <w:szCs w:val="14"/>
+              </w:rPr>
+            </w:pPr>
+            <w:r>
+              <w:rPr>
+                <w:sz w:val="14"/>
+                <w:szCs w:val="14"/>
+                <w:rFonts w:ascii="Times New Roman" w:hAnsi="Times New Roman" w:cs="Times New Roman"/>
+              </w:rPr>
+              <w:t>AO</w:t>
+            </w:r>
+          </w:p>
+        </w:tc>
+        <w:tc>
+          <w:tcPr>
+            <w:tcW w:w="581" w:type="dxa"/>
+            <w:tcBorders>
+              <w:top w:val="single" w:sz="8" w:space="0" w:color="auto"/>
+              <w:left w:val="nil"/>
+              <w:bottom w:val="single" w:sz="8" w:space="0" w:color="auto"/>
+              <w:right w:val="single" w:sz="8" w:space="0" w:color="auto"/>
+            </w:tcBorders>
+            <w:shd w:val="clear" w:color="auto" w:fill="FFFFFF" w:themeFill="background1"/>
+            <w:tcMar>
+              <w:left w:w="108" w:type="dxa"/>
+              <w:right w:w="108" w:type="dxa"/>
+            </w:tcMar>
+            <w:vAlign w:val="center"/>
+          </w:tcPr>
+          <w:p>
+            <w:pPr>
+              <w:jc w:val="center"/>
+            </w:pPr>
+            <w:r>
+              <w:rPr>
+                <w:color w:val="000000" w:themeColor="text1"/>
+                <w:sz w:val="14"/>
+                <w:szCs w:val="14"/>
+                <w:rFonts w:ascii="Times New Roman" w:hAnsi="Times New Roman" w:cs="Times New Roman"/>
+              </w:rPr>
+              <w:t xml:space="preserve">Date of Testing</w:t>
+            </w:r>
+          </w:p>
+        </w:tc>
+        <w:tc>
+          <w:tcPr>
+            <w:tcW w:w="1505" w:type="dxa"/>
+            <w:gridSpan w:val="2"/>
+            <w:tcBorders>
+              <w:top w:val="single" w:sz="8" w:space="0" w:color="auto"/>
+              <w:left w:val="single" w:sz="8" w:space="0" w:color="auto"/>
+              <w:bottom w:val="single" w:sz="8" w:space="0" w:color="auto"/>
+              <w:right w:val="single" w:sz="8" w:space="0" w:color="auto"/>
+            </w:tcBorders>
+            <w:shd w:val="clear" w:color="auto" w:fill="FFFFFF" w:themeFill="background1"/>
+            <w:tcMar>
+              <w:left w:w="108" w:type="dxa"/>
+              <w:right w:w="108" w:type="dxa"/>
+            </w:tcMar>
+            <w:vAlign w:val="center"/>
+          </w:tcPr>
+          <w:p>
+            <w:pPr>
+              <w:jc w:val="center"/>
+              <w:spacing w:before="0" w:after="0" w:line="240" w:lineRule="auto"/>
+              <w:rPr>
+                <w:rFonts w:ascii="Times New Roman" w:hAnsi="Times New Roman"/>
+                <w:sz w:val="14"/>
+                <w:szCs w:val="14"/>
+              </w:rPr>
+            </w:pPr>
+            <w:r>
+              <w:rPr>
+                <w:sz w:val="14"/>
+                <w:szCs w:val="14"/>
+                <w:rFonts w:ascii="Times New Roman" w:hAnsi="Times New Roman" w:cs="Times New Roman"/>
+              </w:rPr>
+              <w:t>No growth</w:t>
+            </w:r>
+          </w:p>
+        </w:tc>
+        <w:tc>
+          <w:tcPr>
+            <w:tcW w:w="1444" w:type="dxa"/>
+            <w:tcBorders>
+              <w:top w:val="single" w:sz="8" w:space="0" w:color="auto"/>
+              <w:left w:val="nil"/>
+              <w:bottom w:val="single" w:sz="8" w:space="0" w:color="auto"/>
+              <w:right w:val="single" w:sz="8" w:space="0" w:color="auto"/>
+            </w:tcBorders>
+            <w:shd w:val="clear" w:color="auto" w:fill="FFFFFF" w:themeFill="background1"/>
+            <w:tcMar>
+              <w:left w:w="108" w:type="dxa"/>
+              <w:right w:w="108" w:type="dxa"/>
+            </w:tcMar>
+            <w:vAlign w:val="center"/>
+          </w:tcPr>
+          <w:p>
+            <w:pPr>
+              <w:jc w:val="center"/>
+              <w:spacing w:before="0" w:after="0" w:line="240" w:lineRule="auto"/>
+              <w:rPr>
+                <w:rFonts w:ascii="Times New Roman" w:hAnsi="Times New Roman"/>
+                <w:sz w:val="14"/>
+                <w:szCs w:val="14"/>
+              </w:rPr>
+            </w:pPr>
+            <w:r>
+              <w:rPr>
+                <w:sz w:val="14"/>
+                <w:szCs w:val="14"/>
+                <w:rFonts w:ascii="Times New Roman" w:hAnsi="Times New Roman" w:cs="Times New Roman"/>
+              </w:rPr>
+              <w:t>N/A</w:t>
+            </w:r>
+          </w:p>
+        </w:tc>
+        <w:tc>
+          <w:tcPr>
+            <w:tcW w:w="1394" w:type="dxa"/>
+            <w:tcBorders>
+              <w:top w:val="single" w:sz="8" w:space="0" w:color="auto"/>
+              <w:left w:val="single" w:sz="8" w:space="0" w:color="auto"/>
+              <w:bottom w:val="single" w:sz="8" w:space="0" w:color="auto"/>
+              <w:right w:val="single" w:sz="8" w:space="0" w:color="auto"/>
+            </w:tcBorders>
+            <w:shd w:val="clear" w:color="auto" w:fill="FFFFFF" w:themeFill="background1"/>
+            <w:tcMar>
+              <w:left w:w="108" w:type="dxa"/>
+              <w:right w:w="108" w:type="dxa"/>
+            </w:tcMar>
+            <w:vAlign w:val="center"/>
+          </w:tcPr>
+          <w:p>
+            <w:pPr>
+              <w:rPr>
+                <w:rFonts w:ascii="Times New Roman" w:hAnsi="Times New Roman"/>
+                <w:color w:val="000000" w:themeColor="text1"/>
+                <w:sz w:val="14"/>
+                <w:szCs w:val="14"/>
+              </w:rPr>
+            </w:pPr>
+            <w:r>
+              <w:rPr>
+                <w:color w:val="000000" w:themeColor="text1"/>
+                <w:sz w:val="14"/>
+                <w:szCs w:val="14"/>
+                <w:rFonts w:ascii="Times New Roman" w:hAnsi="Times New Roman" w:cs="Times New Roman"/>
+              </w:rPr>
+              <w:t w:space="preserve" xml:space="preserve">N/A</w:t>
+            </w:r>
+            <w:r>
+              <w:rPr>
+                <w:color w:val="000000" w:themeColor="text1"/>
+                <w:sz w:val="14"/>
+                <w:szCs w:val="14"/>
+                <w:rFonts w:ascii="Times New Roman" w:hAnsi="Times New Roman" w:cs="Times New Roman"/>
+              </w:rPr>
+              <w:t/>
+            </w:r>
+            <w:r>
+              <w:rPr>
+                <w:color w:val="000000" w:themeColor="text1"/>
+                <w:sz w:val="14"/>
+                <w:szCs w:val="14"/>
+                <w:rFonts w:ascii="Times New Roman" w:hAnsi="Times New Roman" w:cs="Times New Roman"/>
+              </w:rPr>
+              <w:t xml:space="preserve"/>
+            </w:r>
+          </w:p>
+        </w:tc>
+        <w:tc>
+          <w:tcPr>
+            <w:tcW w:w="507" w:type="dxa"/>
+            <w:gridSpan w:val="2"/>
+            <w:tcBorders>
+              <w:top w:val="single" w:sz="8" w:space="0" w:color="auto"/>
+              <w:left w:val="single" w:sz="8" w:space="0" w:color="auto"/>
+              <w:bottom w:val="single" w:sz="8" w:space="0" w:color="auto"/>
+              <w:right w:val="single" w:sz="8" w:space="0" w:color="auto"/>
+            </w:tcBorders>
+            <w:shd w:val="clear" w:color="auto" w:fill="FFFFFF" w:themeFill="background1"/>
+            <w:tcMar>
+              <w:left w:w="108" w:type="dxa"/>
+              <w:right w:w="108" w:type="dxa"/>
+            </w:tcMar>
+            <w:vAlign w:val="center"/>
+          </w:tcPr>
+          <w:p>
+            <w:pPr>
+              <w:jc w:val="center"/>
+              <w:spacing w:before="0" w:after="0" w:line="240" w:lineRule="auto"/>
+              <w:rPr>
+                <w:rFonts w:ascii="Times New Roman" w:hAnsi="Times New Roman"/>
+                <w:sz w:val="14"/>
+                <w:szCs w:val="14"/>
+              </w:rPr>
+            </w:pPr>
+            <w:r>
+              <w:rPr>
+                <w:sz w:val="14"/>
+                <w:szCs w:val="14"/>
+                <w:rFonts w:ascii="Times New Roman" w:hAnsi="Times New Roman" w:cs="Times New Roman"/>
+              </w:rPr>
+              <w:t>None</w:t>
+            </w:r>
+          </w:p>
+        </w:tc>
+      </w:tr>
+      <w:tr>
+        <w:trPr>
+          <w:trHeight w:val="300"/>
+          <w:trHeight w:val="220" w:hRule="atLeast"/>
+        </w:trPr>
+        <w:tc>
+          <w:tcPr>
+            <w:tcW w:w="837" w:type="dxa"/>
+            <w:tcBorders>
+              <w:top w:val="single" w:sz="8" w:space="0" w:color="auto"/>
+              <w:left w:val="single" w:sz="8" w:space="0" w:color="auto"/>
+              <w:bottom w:val="single" w:sz="8" w:space="0" w:color="auto"/>
+              <w:right w:val="single" w:sz="8" w:space="0" w:color="auto"/>
+            </w:tcBorders>
+            <w:shd w:val="clear" w:color="auto" w:fill="FFFFFF" w:themeFill="background1"/>
+            <w:tcMar>
+              <w:left w:w="108" w:type="dxa"/>
+              <w:right w:w="108" w:type="dxa"/>
+            </w:tcMar>
+            <w:vAlign w:val="center"/>
+          </w:tcPr>
+          <w:p>
+            <w:pPr>
+              <w:jc w:val="center"/>
+            </w:pPr>
+            <w:r>
+              <w:rPr>
+                <w:color w:val="000000" w:themeColor="text1"/>
+                <w:sz w:val="14"/>
+                <w:szCs w:val="14"/>
+                <w:rFonts w:ascii="Times New Roman" w:hAnsi="Times New Roman" w:cs="Times New Roman"/>
+              </w:rPr>
+              <w:t>Personnel (Left Touch and Right Touch)</w:t>
+            </w:r>
+          </w:p>
+        </w:tc>
+        <w:tc>
+          <w:tcPr>
+            <w:tcW w:w="698" w:type="dxa"/>
+            <w:gridSpan w:val="2"/>
+            <w:tcBorders>
+              <w:top w:val="single" w:sz="8" w:space="0" w:color="auto"/>
+              <w:left w:val="single" w:sz="8" w:space="0" w:color="auto"/>
+              <w:bottom w:val="single" w:sz="8" w:space="0" w:color="auto"/>
+              <w:right w:val="single" w:sz="8" w:space="0" w:color="auto"/>
+            </w:tcBorders>
+            <w:shd w:val="clear" w:color="auto" w:fill="FFFFFF" w:themeFill="background1"/>
+            <w:tcMar>
+              <w:left w:w="108" w:type="dxa"/>
+              <w:right w:w="108" w:type="dxa"/>
+            </w:tcMar>
+            <w:vAlign w:val="center"/>
+          </w:tcPr>
+          <w:p>
+            <w:pPr>
+              <w:jc w:val="center"/>
+            </w:pPr>
+            <w:r>
+              <w:rPr>
+                <w:color w:val="000000" w:themeColor="text1"/>
+                <w:sz w:val="14"/>
+                <w:szCs w:val="14"/>
+                <w:rFonts w:ascii="Times New Roman" w:hAnsi="Times New Roman" w:cs="Times New Roman"/>
+              </w:rPr>
+              <w:t xml:space="preserve">Daily</w:t>
+            </w:r>
+          </w:p>
+        </w:tc>
+        <w:tc>
+          <w:tcPr>
+            <w:tcW w:w="1206" w:type="dxa"/>
+            <w:tcBorders>
+              <w:top w:val="single" w:sz="8" w:space="0" w:color="auto"/>
+              <w:left w:val="nil"/>
+              <w:bottom w:val="single" w:sz="8" w:space="0" w:color="auto"/>
+              <w:right w:val="single" w:sz="8" w:space="0" w:color="auto"/>
+            </w:tcBorders>
+            <w:shd w:val="clear" w:color="auto" w:fill="FFFFFF" w:themeFill="background1"/>
+            <w:tcMar>
+              <w:left w:w="108" w:type="dxa"/>
+              <w:right w:w="108" w:type="dxa"/>
+            </w:tcMar>
+            <w:vAlign w:val="center"/>
+          </w:tcPr>
+          <w:p>
+            <w:pPr>
+              <w:jc w:val="center"/>
+              <w:spacing w:before="0" w:after="0" w:line="240" w:lineRule="auto"/>
+              <w:rPr>
+                <w:rFonts w:ascii="Times New Roman" w:hAnsi="Times New Roman"/>
+                <w:sz w:val="14"/>
+                <w:szCs w:val="14"/>
+              </w:rPr>
+            </w:pPr>
+            <w:r>
+              <w:rPr>
+                <w:sz w:val="14"/>
+                <w:szCs w:val="14"/>
+                <w:rFonts w:ascii="Times New Roman" w:hAnsi="Times New Roman" w:cs="Times New Roman"/>
+              </w:rPr>
+              <w:t>16Sep26</w:t>
+            </w:r>
+          </w:p>
+        </w:tc>
+        <w:tc>
+          <w:tcPr>
+            <w:tcW w:w="1168" w:type="dxa"/>
+            <w:gridSpan w:val="2"/>
+            <w:tcBorders>
+              <w:top w:val="single" w:sz="8" w:space="0" w:color="auto"/>
+              <w:left w:val="single" w:sz="8" w:space="0" w:color="auto"/>
+              <w:bottom w:val="single" w:sz="8" w:space="0" w:color="auto"/>
+              <w:right w:val="single" w:sz="8" w:space="0" w:color="auto"/>
+            </w:tcBorders>
+            <w:shd w:val="clear" w:color="auto" w:fill="FFFFFF" w:themeFill="background1"/>
+            <w:tcMar>
+              <w:left w:w="108" w:type="dxa"/>
+              <w:right w:w="108" w:type="dxa"/>
+            </w:tcMar>
+            <w:vAlign w:val="center"/>
+          </w:tcPr>
+          <w:p>
+            <w:pPr>
+              <w:jc w:val="center"/>
+              <w:spacing w:before="0" w:after="0" w:line="240" w:lineRule="auto"/>
+              <w:rPr>
+                <w:rFonts w:ascii="Times New Roman" w:hAnsi="Times New Roman"/>
+                <w:sz w:val="14"/>
+                <w:szCs w:val="14"/>
+              </w:rPr>
+            </w:pPr>
+            <w:r>
+              <w:rPr>
+                <w:sz w:val="14"/>
+                <w:szCs w:val="14"/>
+                <w:rFonts w:ascii="Times New Roman" w:hAnsi="Times New Roman" w:cs="Times New Roman"/>
+              </w:rPr>
+              <w:t>AO</w:t>
+            </w:r>
+          </w:p>
+        </w:tc>
+        <w:tc>
+          <w:tcPr>
+            <w:tcW w:w="581" w:type="dxa"/>
+            <w:tcBorders>
+              <w:top w:val="single" w:sz="8" w:space="0" w:color="auto"/>
+              <w:left w:val="nil"/>
+              <w:bottom w:val="single" w:sz="8" w:space="0" w:color="auto"/>
+              <w:right w:val="single" w:sz="8" w:space="0" w:color="auto"/>
+            </w:tcBorders>
+            <w:shd w:val="clear" w:color="auto" w:fill="FFFFFF" w:themeFill="background1"/>
+            <w:tcMar>
+              <w:left w:w="108" w:type="dxa"/>
+              <w:right w:w="108" w:type="dxa"/>
+            </w:tcMar>
+            <w:vAlign w:val="center"/>
+          </w:tcPr>
+          <w:p>
+            <w:pPr>
+              <w:jc w:val="center"/>
+            </w:pPr>
+            <w:r>
+              <w:rPr>
+                <w:color w:val="000000" w:themeColor="text1"/>
+                <w:sz w:val="14"/>
+                <w:szCs w:val="14"/>
+                <w:rFonts w:ascii="Times New Roman" w:hAnsi="Times New Roman" w:cs="Times New Roman"/>
+              </w:rPr>
+              <w:t xml:space="preserve">Date After Testing</w:t>
+            </w:r>
+          </w:p>
+        </w:tc>
+        <w:tc>
+          <w:tcPr>
+            <w:tcW w:w="1505" w:type="dxa"/>
+            <w:gridSpan w:val="2"/>
+            <w:tcBorders>
+              <w:top w:val="single" w:sz="8" w:space="0" w:color="auto"/>
+              <w:left w:val="single" w:sz="8" w:space="0" w:color="auto"/>
+              <w:bottom w:val="single" w:sz="8" w:space="0" w:color="auto"/>
+              <w:right w:val="single" w:sz="8" w:space="0" w:color="auto"/>
+            </w:tcBorders>
+            <w:shd w:val="clear" w:color="auto" w:fill="FFFFFF" w:themeFill="background1"/>
+            <w:tcMar>
+              <w:left w:w="108" w:type="dxa"/>
+              <w:right w:w="108" w:type="dxa"/>
+            </w:tcMar>
+            <w:vAlign w:val="center"/>
+          </w:tcPr>
+          <w:p>
+            <w:pPr>
+              <w:jc w:val="center"/>
+              <w:spacing w:before="0" w:after="0" w:line="240" w:lineRule="auto"/>
+              <w:rPr>
+                <w:rFonts w:ascii="Times New Roman" w:hAnsi="Times New Roman"/>
+                <w:sz w:val="14"/>
+                <w:szCs w:val="14"/>
+              </w:rPr>
+            </w:pPr>
+            <w:r>
+              <w:rPr>
+                <w:sz w:val="14"/>
+                <w:szCs w:val="14"/>
+                <w:rFonts w:ascii="Times New Roman" w:hAnsi="Times New Roman" w:cs="Times New Roman"/>
+              </w:rPr>
+              <w:t>No growth</w:t>
+            </w:r>
+          </w:p>
+        </w:tc>
+        <w:tc>
+          <w:tcPr>
+            <w:tcW w:w="1444" w:type="dxa"/>
+            <w:tcBorders>
+              <w:top w:val="single" w:sz="8" w:space="0" w:color="auto"/>
+              <w:left w:val="nil"/>
+              <w:bottom w:val="single" w:sz="8" w:space="0" w:color="auto"/>
+              <w:right w:val="single" w:sz="8" w:space="0" w:color="auto"/>
+            </w:tcBorders>
+            <w:shd w:val="clear" w:color="auto" w:fill="FFFFFF" w:themeFill="background1"/>
+            <w:tcMar>
+              <w:left w:w="108" w:type="dxa"/>
+              <w:right w:w="108" w:type="dxa"/>
+            </w:tcMar>
+            <w:vAlign w:val="center"/>
+          </w:tcPr>
+          <w:p>
+            <w:pPr>
+              <w:jc w:val="center"/>
+              <w:spacing w:before="0" w:after="0" w:line="240" w:lineRule="auto"/>
+              <w:rPr>
+                <w:rFonts w:ascii="Times New Roman" w:hAnsi="Times New Roman"/>
+                <w:sz w:val="14"/>
+                <w:szCs w:val="14"/>
+              </w:rPr>
+            </w:pPr>
+            <w:r>
+              <w:rPr>
+                <w:sz w:val="14"/>
+                <w:szCs w:val="14"/>
+                <w:rFonts w:ascii="Times New Roman" w:hAnsi="Times New Roman" w:cs="Times New Roman"/>
+              </w:rPr>
+              <w:t>N/A</w:t>
+            </w:r>
+          </w:p>
+        </w:tc>
+        <w:tc>
+          <w:tcPr>
+            <w:tcW w:w="1394" w:type="dxa"/>
+            <w:tcBorders>
+              <w:top w:val="single" w:sz="8" w:space="0" w:color="auto"/>
+              <w:left w:val="single" w:sz="8" w:space="0" w:color="auto"/>
+              <w:bottom w:val="single" w:sz="8" w:space="0" w:color="auto"/>
+              <w:right w:val="single" w:sz="8" w:space="0" w:color="auto"/>
+            </w:tcBorders>
+            <w:shd w:val="clear" w:color="auto" w:fill="FFFFFF" w:themeFill="background1"/>
+            <w:tcMar>
+              <w:left w:w="108" w:type="dxa"/>
+              <w:right w:w="108" w:type="dxa"/>
+            </w:tcMar>
+            <w:vAlign w:val="center"/>
+          </w:tcPr>
+          <w:p>
+            <w:r>
+              <w:rPr>
+                <w:color w:val="000000" w:themeColor="text1"/>
+                <w:sz w:val="14"/>
+                <w:szCs w:val="14"/>
+                <w:rFonts w:ascii="Times New Roman" w:hAnsi="Times New Roman" w:cs="Times New Roman"/>
+              </w:rPr>
+              <w:t xml:space="preserve" w:space="preserve">N/A</w:t>
+            </w:r>
+            <w:r>
+              <w:rPr>
+                <w:color w:val="000000" w:themeColor="text1"/>
+                <w:sz w:val="14"/>
+                <w:szCs w:val="14"/>
+                <w:rFonts w:ascii="Times New Roman" w:hAnsi="Times New Roman" w:cs="Times New Roman"/>
+              </w:rPr>
+              <w:t/>
+            </w:r>
+            <w:r>
+              <w:rPr>
+                <w:color w:val="000000" w:themeColor="text1"/>
+                <w:sz w:val="14"/>
+                <w:szCs w:val="14"/>
+                <w:rFonts w:ascii="Times New Roman" w:hAnsi="Times New Roman" w:cs="Times New Roman"/>
+              </w:rPr>
+              <w:t/>
+            </w:r>
+            <w:r>
+              <w:rPr>
+                <w:color w:val="000000" w:themeColor="text1"/>
+                <w:sz w:val="14"/>
+                <w:szCs w:val="14"/>
+                <w:rFonts w:ascii="Times New Roman" w:hAnsi="Times New Roman" w:cs="Times New Roman"/>
+              </w:rPr>
+              <w:t/>
+            </w:r>
+            <w:r>
+              <w:rPr>
+                <w:color w:val="000000" w:themeColor="text1"/>
+                <w:sz w:val="14"/>
+                <w:szCs w:val="14"/>
+                <w:rFonts w:ascii="Times New Roman" w:hAnsi="Times New Roman" w:cs="Times New Roman"/>
+              </w:rPr>
+              <w:t xml:space="preserve"/>
+            </w:r>
+          </w:p>
+        </w:tc>
+        <w:tc>
+          <w:tcPr>
+            <w:tcW w:w="507" w:type="dxa"/>
+            <w:gridSpan w:val="2"/>
+            <w:tcBorders>
+              <w:top w:val="single" w:sz="8" w:space="0" w:color="auto"/>
+              <w:left w:val="single" w:sz="8" w:space="0" w:color="auto"/>
+              <w:bottom w:val="single" w:sz="8" w:space="0" w:color="auto"/>
+              <w:right w:val="single" w:sz="8" w:space="0" w:color="auto"/>
+            </w:tcBorders>
+            <w:shd w:val="clear" w:color="auto" w:fill="FFFFFF" w:themeFill="background1"/>
+            <w:tcMar>
+              <w:left w:w="108" w:type="dxa"/>
+              <w:right w:w="108" w:type="dxa"/>
+            </w:tcMar>
+            <w:vAlign w:val="center"/>
+          </w:tcPr>
+          <w:p>
+            <w:pPr>
+              <w:jc w:val="center"/>
+              <w:spacing w:before="0" w:after="0" w:line="240" w:lineRule="auto"/>
+              <w:rPr>
+                <w:rFonts w:ascii="Times New Roman" w:hAnsi="Times New Roman"/>
+                <w:sz w:val="14"/>
+                <w:szCs w:val="14"/>
+              </w:rPr>
+            </w:pPr>
+            <w:r>
+              <w:rPr>
+                <w:sz w:val="14"/>
+                <w:szCs w:val="14"/>
+                <w:rFonts w:ascii="Times New Roman" w:hAnsi="Times New Roman" w:cs="Times New Roman"/>
+              </w:rPr>
+              <w:t>None</w:t>
+            </w:r>
+          </w:p>
+        </w:tc>
+      </w:tr>
+      <w:tr>
+        <w:trPr>
+          <w:trHeight w:val="300"/>
+          <w:trHeight w:val="220" w:hRule="atLeast"/>
+        </w:trPr>
+        <w:tc>
+          <w:tcPr>
+            <w:tcW w:w="9340" w:type="dxa"/>
+            <w:gridSpan w:val="13"/>
+            <w:tcBorders>
+              <w:top w:val="single" w:sz="8" w:space="0" w:color="auto"/>
+              <w:left w:val="single" w:sz="8" w:space="0" w:color="auto"/>
+              <w:bottom w:val="single" w:sz="8" w:space="0" w:color="auto"/>
+              <w:right w:val="single" w:sz="8" w:space="0" w:color="000000" w:themeColor="text1"/>
+            </w:tcBorders>
+            <w:shd w:val="clear" w:color="auto" w:fill="D9D9D9" w:themeFill="background1" w:themeFillShade="D9"/>
+            <w:tcMar>
+              <w:left w:w="108" w:type="dxa"/>
+              <w:right w:w="108" w:type="dxa"/>
+            </w:tcMar>
+            <w:vAlign w:val="center"/>
+          </w:tcPr>
+          <w:p>
+            <w:r>
+              <w:rPr>
+                <w:b/>
+                <w:bCs/>
+                <w:color w:val="000000" w:themeColor="text1"/>
+                <w:sz w:val="14"/>
+                <w:szCs w:val="14"/>
+                <w:rFonts w:ascii="Times New Roman" w:hAnsi="Times New Roman" w:cs="Times New Roman"/>
+              </w:rPr>
+              <w:t>Biological Safety Cabinet EM Bracketing Biological Safety Cabinet (BSC)</w:t>
+            </w:r>
+          </w:p>
+        </w:tc>
+      </w:tr>
+      <w:tr>
+        <w:trPr>
+          <w:trHeight w:val="300"/>
+          <w:trHeight w:val="220" w:hRule="atLeast"/>
+        </w:trPr>
+        <w:tc>
+          <w:tcPr>
+            <w:tcW w:w="837" w:type="dxa"/>
+            <w:tcBorders>
+              <w:top w:val="single" w:sz="8" w:space="0" w:color="auto"/>
+              <w:left w:val="single" w:sz="8" w:space="0" w:color="auto"/>
+              <w:bottom w:val="single" w:sz="8" w:space="0" w:color="auto"/>
+              <w:right w:val="single" w:sz="8" w:space="0" w:color="000000" w:themeColor="text1"/>
+            </w:tcBorders>
+            <w:shd w:val="clear" w:color="auto" w:fill="FFFFFF" w:themeFill="background1"/>
+            <w:tcMar>
+              <w:left w:w="108" w:type="dxa"/>
+              <w:right w:w="108" w:type="dxa"/>
+            </w:tcMar>
+            <w:vAlign w:val="center"/>
+          </w:tcPr>
+          <w:p>
+            <w:pPr>
+              <w:jc w:val="center"/>
+            </w:pPr>
+            <w:r>
+              <w:rPr>
+                <w:color w:val="000000" w:themeColor="text1"/>
+                <w:sz w:val="14"/>
+                <w:szCs w:val="14"/>
+                <w:rFonts w:ascii="Times New Roman" w:hAnsi="Times New Roman" w:cs="Times New Roman"/>
+              </w:rPr>
+              <w:t>Surface Sampling of ISO 5 (4 locations)</w:t>
+            </w:r>
+          </w:p>
+        </w:tc>
+        <w:tc>
+          <w:tcPr>
+            <w:tcW w:w="698" w:type="dxa"/>
+            <w:gridSpan w:val="2"/>
+            <w:tcBorders>
+              <w:top w:val="nil"/>
+              <w:left w:val="single" w:sz="8" w:space="0" w:color="auto"/>
+              <w:bottom w:val="single" w:sz="8" w:space="0" w:color="auto"/>
+              <w:right w:val="single" w:sz="8" w:space="0" w:color="auto"/>
+            </w:tcBorders>
+            <w:shd w:val="clear" w:color="auto" w:fill="FFFFFF" w:themeFill="background1"/>
+            <w:tcMar>
+              <w:left w:w="108" w:type="dxa"/>
+              <w:right w:w="108" w:type="dxa"/>
+            </w:tcMar>
+            <w:vAlign w:val="center"/>
+          </w:tcPr>
+          <w:p>
+            <w:pPr>
+              <w:jc w:val="center"/>
+            </w:pPr>
+            <w:r>
+              <w:rPr>
+                <w:color w:val="000000" w:themeColor="text1"/>
+                <w:sz w:val="14"/>
+                <w:szCs w:val="14"/>
+                <w:rFonts w:ascii="Times New Roman" w:hAnsi="Times New Roman" w:cs="Times New Roman"/>
+              </w:rPr>
+              <w:t xml:space="preserve">Daily</w:t>
+            </w:r>
+          </w:p>
+        </w:tc>
+        <w:tc>
+          <w:tcPr>
+            <w:tcW w:w="1206" w:type="dxa"/>
+            <w:tcBorders>
+              <w:top w:val="nil"/>
+              <w:left w:val="nil"/>
+              <w:bottom w:val="single" w:sz="8" w:space="0" w:color="auto"/>
+              <w:right w:val="single" w:sz="8" w:space="0" w:color="auto"/>
+            </w:tcBorders>
+            <w:shd w:val="clear" w:color="auto" w:fill="FFFFFF" w:themeFill="background1"/>
+            <w:tcMar>
+              <w:left w:w="108" w:type="dxa"/>
+              <w:right w:w="108" w:type="dxa"/>
+            </w:tcMar>
+            <w:vAlign w:val="center"/>
+          </w:tcPr>
+          <w:p>
+            <w:pPr>
+              <w:jc w:val="center"/>
+              <w:spacing w:before="0" w:after="0" w:line="240" w:lineRule="auto"/>
+              <w:rPr>
+                <w:rFonts w:ascii="Times New Roman" w:hAnsi="Times New Roman"/>
+                <w:sz w:val="14"/>
+                <w:szCs w:val="14"/>
+              </w:rPr>
+            </w:pPr>
+            <w:r>
+              <w:rPr>
+                <w:sz w:val="14"/>
+                <w:szCs w:val="14"/>
+                <w:rFonts w:ascii="Times New Roman" w:hAnsi="Times New Roman" w:cs="Times New Roman"/>
+              </w:rPr>
+              <w:t>10Sep26</w:t>
+            </w:r>
+          </w:p>
+        </w:tc>
+        <w:tc>
+          <w:tcPr>
+            <w:tcW w:w="1168" w:type="dxa"/>
+            <w:gridSpan w:val="2"/>
+            <w:tcBorders>
+              <w:top w:val="nil"/>
+              <w:left w:val="single" w:sz="8" w:space="0" w:color="auto"/>
+              <w:bottom w:val="single" w:sz="8" w:space="0" w:color="auto"/>
+              <w:right w:val="single" w:sz="8" w:space="0" w:color="auto"/>
+            </w:tcBorders>
+            <w:shd w:val="clear" w:color="auto" w:fill="FFFFFF" w:themeFill="background1"/>
+            <w:tcMar>
+              <w:left w:w="108" w:type="dxa"/>
+              <w:right w:w="108" w:type="dxa"/>
+            </w:tcMar>
+            <w:vAlign w:val="center"/>
+          </w:tcPr>
+          <w:p>
+            <w:pPr>
+              <w:jc w:val="center"/>
+              <w:spacing w:before="0" w:after="0" w:line="240" w:lineRule="auto"/>
+              <w:rPr>
+                <w:rFonts w:ascii="Times New Roman" w:hAnsi="Times New Roman"/>
+                <w:sz w:val="14"/>
+                <w:szCs w:val="14"/>
+              </w:rPr>
+            </w:pPr>
+            <w:r>
+              <w:rPr>
+                <w:sz w:val="14"/>
+                <w:szCs w:val="14"/>
+                <w:rFonts w:ascii="Times New Roman" w:hAnsi="Times New Roman" w:cs="Times New Roman"/>
+              </w:rPr>
+              <w:t>AO</w:t>
+            </w:r>
+          </w:p>
+        </w:tc>
+        <w:tc>
+          <w:tcPr>
+            <w:tcW w:w="581" w:type="dxa"/>
+            <w:tcBorders>
+              <w:top w:val="nil"/>
+              <w:left w:val="nil"/>
+              <w:bottom w:val="single" w:sz="8" w:space="0" w:color="auto"/>
+              <w:right w:val="single" w:sz="8" w:space="0" w:color="auto"/>
+            </w:tcBorders>
+            <w:shd w:val="clear" w:color="auto" w:fill="FFFFFF" w:themeFill="background1"/>
+            <w:tcMar>
+              <w:left w:w="108" w:type="dxa"/>
+              <w:right w:w="108" w:type="dxa"/>
+            </w:tcMar>
+            <w:vAlign w:val="center"/>
+          </w:tcPr>
+          <w:p>
+            <w:pPr>
+              <w:jc w:val="center"/>
+            </w:pPr>
+            <w:r>
+              <w:rPr>
+                <w:color w:val="000000" w:themeColor="text1"/>
+                <w:sz w:val="14"/>
+                <w:szCs w:val="14"/>
+                <w:rFonts w:ascii="Times New Roman" w:hAnsi="Times New Roman" w:cs="Times New Roman"/>
+              </w:rPr>
+              <w:t xml:space="preserve">Date Before Testing</w:t>
+            </w:r>
+          </w:p>
+        </w:tc>
+        <w:tc>
+          <w:tcPr>
+            <w:tcW w:w="1505" w:type="dxa"/>
+            <w:gridSpan w:val="2"/>
+            <w:tcBorders>
+              <w:top w:val="nil"/>
+              <w:left w:val="single" w:sz="8" w:space="0" w:color="auto"/>
+              <w:bottom w:val="single" w:sz="8" w:space="0" w:color="auto"/>
+              <w:right w:val="single" w:sz="8" w:space="0" w:color="auto"/>
+            </w:tcBorders>
+            <w:shd w:val="clear" w:color="auto" w:fill="FFFFFF" w:themeFill="background1"/>
+            <w:tcMar>
+              <w:left w:w="108" w:type="dxa"/>
+              <w:right w:w="108" w:type="dxa"/>
+            </w:tcMar>
+            <w:vAlign w:val="center"/>
+          </w:tcPr>
+          <w:p>
+            <w:pPr>
+              <w:jc w:val="center"/>
+              <w:spacing w:before="0" w:after="0" w:line="240" w:lineRule="auto"/>
+              <w:rPr>
+                <w:rFonts w:ascii="Times New Roman" w:hAnsi="Times New Roman"/>
+                <w:sz w:val="14"/>
+                <w:szCs w:val="14"/>
+              </w:rPr>
+            </w:pPr>
+            <w:r>
+              <w:rPr>
+                <w:sz w:val="14"/>
+                <w:szCs w:val="14"/>
+                <w:rFonts w:ascii="Times New Roman" w:hAnsi="Times New Roman" w:cs="Times New Roman"/>
+              </w:rPr>
+              <w:t>No growth</w:t>
+            </w:r>
+          </w:p>
+        </w:tc>
+        <w:tc>
+          <w:tcPr>
+            <w:tcW w:w="1444" w:type="dxa"/>
+            <w:tcBorders>
+              <w:top w:val="nil"/>
+              <w:left w:val="nil"/>
+              <w:bottom w:val="single" w:sz="8" w:space="0" w:color="auto"/>
+              <w:right w:val="single" w:sz="8" w:space="0" w:color="auto"/>
+            </w:tcBorders>
+            <w:shd w:val="clear" w:color="auto" w:fill="FFFFFF" w:themeFill="background1"/>
+            <w:tcMar>
+              <w:left w:w="108" w:type="dxa"/>
+              <w:right w:w="108" w:type="dxa"/>
+            </w:tcMar>
+            <w:vAlign w:val="center"/>
+          </w:tcPr>
+          <w:p>
+            <w:pPr>
+              <w:jc w:val="center"/>
+              <w:spacing w:before="0" w:after="0" w:line="240" w:lineRule="auto"/>
+              <w:rPr>
+                <w:rFonts w:ascii="Times New Roman" w:hAnsi="Times New Roman"/>
+                <w:sz w:val="14"/>
+                <w:szCs w:val="14"/>
+              </w:rPr>
+            </w:pPr>
+            <w:r>
+              <w:rPr>
+                <w:sz w:val="14"/>
+                <w:szCs w:val="14"/>
+                <w:rFonts w:ascii="Times New Roman" w:hAnsi="Times New Roman" w:cs="Times New Roman"/>
+              </w:rPr>
+              <w:t>N/A</w:t>
+            </w:r>
+          </w:p>
+        </w:tc>
+        <w:tc>
+          <w:tcPr>
+            <w:tcW w:w="1394" w:type="dxa"/>
+            <w:tcBorders>
+              <w:top w:val="nil"/>
+              <w:left w:val="single" w:sz="8" w:space="0" w:color="auto"/>
+              <w:bottom w:val="single" w:sz="8" w:space="0" w:color="auto"/>
+              <w:right w:val="single" w:sz="8" w:space="0" w:color="auto"/>
+            </w:tcBorders>
+            <w:shd w:val="clear" w:color="auto" w:fill="FFFFFF" w:themeFill="background1"/>
+            <w:tcMar>
+              <w:left w:w="108" w:type="dxa"/>
+              <w:right w:w="108" w:type="dxa"/>
+            </w:tcMar>
+            <w:vAlign w:val="center"/>
+          </w:tcPr>
+          <w:p>
+            <w:r>
+              <w:rPr>
+                <w:color w:val="000000" w:themeColor="text1"/>
+                <w:sz w:val="14"/>
+                <w:szCs w:val="14"/>
+                <w:rFonts w:ascii="Times New Roman" w:hAnsi="Times New Roman" w:cs="Times New Roman"/>
+              </w:rPr>
+              <w:t xml:space="preserve" w:space="preserve">N/A</w:t>
+            </w:r>
+            <w:r>
+              <w:rPr>
+                <w:color w:val="000000" w:themeColor="text1"/>
+                <w:sz w:val="14"/>
+                <w:szCs w:val="14"/>
+                <w:rFonts w:ascii="Times New Roman" w:hAnsi="Times New Roman" w:cs="Times New Roman"/>
+              </w:rPr>
+              <w:t/>
+            </w:r>
+            <w:r>
+              <w:rPr>
+                <w:color w:val="000000" w:themeColor="text1"/>
+                <w:sz w:val="14"/>
+                <w:szCs w:val="14"/>
+                <w:rFonts w:ascii="Times New Roman" w:hAnsi="Times New Roman" w:cs="Times New Roman"/>
+              </w:rPr>
+              <w:t/>
+            </w:r>
+            <w:r>
+              <w:rPr>
+                <w:color w:val="000000" w:themeColor="text1"/>
+                <w:sz w:val="14"/>
+                <w:szCs w:val="14"/>
+                <w:rFonts w:ascii="Times New Roman" w:hAnsi="Times New Roman" w:cs="Times New Roman"/>
+              </w:rPr>
+              <w:t/>
+            </w:r>
+            <w:r>
+              <w:rPr>
+                <w:color w:val="000000" w:themeColor="text1"/>
+                <w:sz w:val="14"/>
+                <w:szCs w:val="14"/>
+                <w:rFonts w:ascii="Times New Roman" w:hAnsi="Times New Roman" w:cs="Times New Roman"/>
+              </w:rPr>
+              <w:t xml:space="preserve"/>
+            </w:r>
+          </w:p>
+        </w:tc>
+        <w:tc>
+          <w:tcPr>
+            <w:tcW w:w="507" w:type="dxa"/>
+            <w:gridSpan w:val="2"/>
+            <w:tcBorders>
+              <w:top w:val="nil"/>
+              <w:left w:val="single" w:sz="8" w:space="0" w:color="auto"/>
+              <w:bottom w:val="single" w:sz="8" w:space="0" w:color="auto"/>
+              <w:right w:val="single" w:sz="8" w:space="0" w:color="auto"/>
+            </w:tcBorders>
+            <w:shd w:val="clear" w:color="auto" w:fill="FFFFFF" w:themeFill="background1"/>
+            <w:tcMar>
+              <w:left w:w="108" w:type="dxa"/>
+              <w:right w:w="108" w:type="dxa"/>
+            </w:tcMar>
+            <w:vAlign w:val="center"/>
+          </w:tcPr>
+          <w:p>
+            <w:pPr>
+              <w:jc w:val="center"/>
+              <w:spacing w:before="0" w:after="0" w:line="240" w:lineRule="auto"/>
+              <w:rPr>
+                <w:rFonts w:ascii="Times New Roman" w:hAnsi="Times New Roman"/>
+                <w:sz w:val="14"/>
+                <w:szCs w:val="14"/>
+              </w:rPr>
+            </w:pPr>
+            <w:r>
+              <w:rPr>
+                <w:sz w:val="14"/>
+                <w:szCs w:val="14"/>
+                <w:rFonts w:ascii="Times New Roman" w:hAnsi="Times New Roman" w:cs="Times New Roman"/>
+              </w:rPr>
+              <w:t>None</w:t>
+            </w:r>
+          </w:p>
+        </w:tc>
+      </w:tr>
+      <w:tr>
+        <w:trPr>
+          <w:trHeight w:val="300"/>
+          <w:trHeight w:val="220" w:hRule="atLeast"/>
+        </w:trPr>
+        <w:tc>
+          <w:tcPr>
+            <w:tcW w:w="837" w:type="dxa"/>
+            <w:tcBorders>
+              <w:top w:val="single" w:sz="8" w:space="0" w:color="auto"/>
+              <w:left w:val="single" w:sz="8" w:space="0" w:color="auto"/>
+              <w:bottom w:val="single" w:sz="8" w:space="0" w:color="auto"/>
+              <w:right w:val="single" w:sz="8" w:space="0" w:color="auto"/>
+            </w:tcBorders>
+            <w:shd w:val="clear" w:color="auto" w:fill="FFFFFF" w:themeFill="background1"/>
+            <w:tcMar>
+              <w:left w:w="108" w:type="dxa"/>
+              <w:right w:w="108" w:type="dxa"/>
+            </w:tcMar>
+            <w:vAlign w:val="center"/>
+          </w:tcPr>
+          <w:p>
+            <w:pPr>
+              <w:jc w:val="center"/>
+            </w:pPr>
+            <w:r>
+              <w:rPr>
+                <w:color w:val="000000" w:themeColor="text1"/>
+                <w:sz w:val="14"/>
+                <w:szCs w:val="14"/>
+                <w:rFonts w:ascii="Times New Roman" w:hAnsi="Times New Roman" w:cs="Times New Roman"/>
+              </w:rPr>
+              <w:t>Surface Sampling of ISO 5</w:t>
+            </w:r>
+          </w:p>
+          <w:p>
+            <w:pPr>
+              <w:jc w:val="center"/>
+            </w:pPr>
+            <w:r>
+              <w:rPr>
+                <w:color w:val="000000" w:themeColor="text1"/>
+                <w:sz w:val="14"/>
+                <w:szCs w:val="14"/>
+                <w:rFonts w:ascii="Times New Roman" w:hAnsi="Times New Roman" w:cs="Times New Roman"/>
+              </w:rPr>
+              <w:t>(4 locations)</w:t>
+            </w:r>
+          </w:p>
+        </w:tc>
+        <w:tc>
+          <w:tcPr>
+            <w:tcW w:w="698" w:type="dxa"/>
+            <w:gridSpan w:val="2"/>
+            <w:tcBorders>
+              <w:top w:val="single" w:sz="8" w:space="0" w:color="auto"/>
+              <w:left w:val="single" w:sz="8" w:space="0" w:color="auto"/>
+              <w:bottom w:val="single" w:sz="8" w:space="0" w:color="auto"/>
+              <w:right w:val="single" w:sz="8" w:space="0" w:color="auto"/>
+            </w:tcBorders>
+            <w:shd w:val="clear" w:color="auto" w:fill="FFFFFF" w:themeFill="background1"/>
+            <w:tcMar>
+              <w:left w:w="108" w:type="dxa"/>
+              <w:right w:w="108" w:type="dxa"/>
+            </w:tcMar>
+            <w:vAlign w:val="center"/>
+          </w:tcPr>
+          <w:p>
+            <w:pPr>
+              <w:jc w:val="center"/>
+            </w:pPr>
+            <w:r>
+              <w:rPr>
+                <w:color w:val="000000" w:themeColor="text1"/>
+                <w:sz w:val="14"/>
+                <w:szCs w:val="14"/>
+                <w:rFonts w:ascii="Times New Roman" w:hAnsi="Times New Roman" w:cs="Times New Roman"/>
+              </w:rPr>
+              <w:t xml:space="preserve">Daily</w:t>
+            </w:r>
+          </w:p>
+        </w:tc>
+        <w:tc>
+          <w:tcPr>
+            <w:tcW w:w="1206" w:type="dxa"/>
+            <w:tcBorders>
+              <w:top w:val="single" w:sz="8" w:space="0" w:color="auto"/>
+              <w:left w:val="nil"/>
+              <w:bottom w:val="single" w:sz="8" w:space="0" w:color="auto"/>
+              <w:right w:val="single" w:sz="8" w:space="0" w:color="auto"/>
+            </w:tcBorders>
+            <w:shd w:val="clear" w:color="auto" w:fill="FFFFFF" w:themeFill="background1"/>
+            <w:tcMar>
+              <w:left w:w="108" w:type="dxa"/>
+              <w:right w:w="108" w:type="dxa"/>
+            </w:tcMar>
+            <w:vAlign w:val="center"/>
+          </w:tcPr>
+          <w:p>
+            <w:pPr>
+              <w:jc w:val="center"/>
+              <w:spacing w:before="0" w:after="0" w:line="240" w:lineRule="auto"/>
+              <w:rPr>
+                <w:rFonts w:ascii="Times New Roman" w:hAnsi="Times New Roman"/>
+                <w:sz w:val="14"/>
+                <w:szCs w:val="14"/>
+              </w:rPr>
+            </w:pPr>
+            <w:r>
+              <w:rPr>
+                <w:sz w:val="14"/>
+                <w:szCs w:val="14"/>
+                <w:rFonts w:ascii="Times New Roman" w:hAnsi="Times New Roman" w:cs="Times New Roman"/>
+              </w:rPr>
+              <w:t>15Sep26</w:t>
+            </w:r>
+          </w:p>
+        </w:tc>
+        <w:tc>
+          <w:tcPr>
+            <w:tcW w:w="1168" w:type="dxa"/>
+            <w:gridSpan w:val="2"/>
+            <w:tcBorders>
+              <w:top w:val="single" w:sz="8" w:space="0" w:color="auto"/>
+              <w:left w:val="single" w:sz="8" w:space="0" w:color="auto"/>
+              <w:bottom w:val="single" w:sz="8" w:space="0" w:color="auto"/>
+              <w:right w:val="single" w:sz="8" w:space="0" w:color="auto"/>
+            </w:tcBorders>
+            <w:shd w:val="clear" w:color="auto" w:fill="FFFFFF" w:themeFill="background1"/>
+            <w:tcMar>
+              <w:left w:w="108" w:type="dxa"/>
+              <w:right w:w="108" w:type="dxa"/>
+            </w:tcMar>
+            <w:vAlign w:val="center"/>
+          </w:tcPr>
+          <w:p>
+            <w:pPr>
+              <w:jc w:val="center"/>
+              <w:spacing w:before="0" w:after="0" w:line="240" w:lineRule="auto"/>
+              <w:rPr>
+                <w:rFonts w:ascii="Times New Roman" w:hAnsi="Times New Roman"/>
+                <w:sz w:val="14"/>
+                <w:szCs w:val="14"/>
+              </w:rPr>
+            </w:pPr>
+            <w:r>
+              <w:rPr>
+                <w:sz w:val="14"/>
+                <w:szCs w:val="14"/>
+                <w:rFonts w:ascii="Times New Roman" w:hAnsi="Times New Roman" w:cs="Times New Roman"/>
+              </w:rPr>
+              <w:t>AO</w:t>
+            </w:r>
+          </w:p>
+        </w:tc>
+        <w:tc>
+          <w:tcPr>
+            <w:tcW w:w="581" w:type="dxa"/>
+            <w:tcBorders>
+              <w:top w:val="single" w:sz="8" w:space="0" w:color="auto"/>
+              <w:left w:val="nil"/>
+              <w:bottom w:val="single" w:sz="8" w:space="0" w:color="auto"/>
+              <w:right w:val="single" w:sz="8" w:space="0" w:color="auto"/>
+            </w:tcBorders>
+            <w:shd w:val="clear" w:color="auto" w:fill="FFFFFF" w:themeFill="background1"/>
+            <w:tcMar>
+              <w:left w:w="108" w:type="dxa"/>
+              <w:right w:w="108" w:type="dxa"/>
+            </w:tcMar>
+            <w:vAlign w:val="center"/>
+          </w:tcPr>
+          <w:p>
+            <w:pPr>
+              <w:jc w:val="center"/>
+            </w:pPr>
+            <w:r>
+              <w:rPr>
+                <w:color w:val="000000" w:themeColor="text1"/>
+                <w:sz w:val="14"/>
+                <w:szCs w:val="14"/>
+                <w:rFonts w:ascii="Times New Roman" w:hAnsi="Times New Roman" w:cs="Times New Roman"/>
+              </w:rPr>
+              <w:t xml:space="preserve">Date of Testing</w:t>
+            </w:r>
+          </w:p>
+        </w:tc>
+        <w:tc>
+          <w:tcPr>
+            <w:tcW w:w="1505" w:type="dxa"/>
+            <w:gridSpan w:val="2"/>
+            <w:tcBorders>
+              <w:top w:val="single" w:sz="8" w:space="0" w:color="auto"/>
+              <w:left w:val="single" w:sz="8" w:space="0" w:color="auto"/>
+              <w:bottom w:val="single" w:sz="8" w:space="0" w:color="auto"/>
+              <w:right w:val="single" w:sz="8" w:space="0" w:color="auto"/>
+            </w:tcBorders>
+            <w:shd w:val="clear" w:color="auto" w:fill="FFFFFF" w:themeFill="background1"/>
+            <w:tcMar>
+              <w:left w:w="108" w:type="dxa"/>
+              <w:right w:w="108" w:type="dxa"/>
+            </w:tcMar>
+            <w:vAlign w:val="center"/>
+          </w:tcPr>
+          <w:p>
+            <w:pPr>
+              <w:jc w:val="center"/>
+              <w:spacing w:before="0" w:after="0" w:line="240" w:lineRule="auto"/>
+              <w:rPr>
+                <w:rFonts w:ascii="Times New Roman" w:hAnsi="Times New Roman"/>
+                <w:sz w:val="14"/>
+                <w:szCs w:val="14"/>
+              </w:rPr>
+            </w:pPr>
+            <w:r>
+              <w:rPr>
+                <w:sz w:val="14"/>
+                <w:szCs w:val="14"/>
+                <w:rFonts w:ascii="Times New Roman" w:hAnsi="Times New Roman" w:cs="Times New Roman"/>
+              </w:rPr>
+              <w:t>No growth</w:t>
+            </w:r>
+          </w:p>
+        </w:tc>
+        <w:tc>
+          <w:tcPr>
+            <w:tcW w:w="1444" w:type="dxa"/>
+            <w:tcBorders>
+              <w:top w:val="single" w:sz="8" w:space="0" w:color="auto"/>
+              <w:left w:val="nil"/>
+              <w:bottom w:val="single" w:sz="8" w:space="0" w:color="auto"/>
+              <w:right w:val="single" w:sz="8" w:space="0" w:color="auto"/>
+            </w:tcBorders>
+            <w:shd w:val="clear" w:color="auto" w:fill="FFFFFF" w:themeFill="background1"/>
+            <w:tcMar>
+              <w:left w:w="108" w:type="dxa"/>
+              <w:right w:w="108" w:type="dxa"/>
+            </w:tcMar>
+            <w:vAlign w:val="center"/>
+          </w:tcPr>
+          <w:p>
+            <w:pPr>
+              <w:jc w:val="center"/>
+              <w:spacing w:before="0" w:after="0" w:line="240" w:lineRule="auto"/>
+              <w:rPr>
+                <w:rFonts w:ascii="Times New Roman" w:hAnsi="Times New Roman"/>
+                <w:sz w:val="14"/>
+                <w:szCs w:val="14"/>
+              </w:rPr>
+            </w:pPr>
+            <w:r>
+              <w:rPr>
+                <w:sz w:val="14"/>
+                <w:szCs w:val="14"/>
+                <w:rFonts w:ascii="Times New Roman" w:hAnsi="Times New Roman" w:cs="Times New Roman"/>
+              </w:rPr>
+              <w:t>N/A</w:t>
+            </w:r>
+          </w:p>
+        </w:tc>
+        <w:tc>
+          <w:tcPr>
+            <w:tcW w:w="1394" w:type="dxa"/>
+            <w:tcBorders>
+              <w:top w:val="single" w:sz="8" w:space="0" w:color="auto"/>
+              <w:left w:val="single" w:sz="8" w:space="0" w:color="auto"/>
+              <w:bottom w:val="single" w:sz="8" w:space="0" w:color="auto"/>
+              <w:right w:val="single" w:sz="8" w:space="0" w:color="auto"/>
+            </w:tcBorders>
+            <w:shd w:val="clear" w:color="auto" w:fill="FFFFFF" w:themeFill="background1"/>
+            <w:tcMar>
+              <w:left w:w="108" w:type="dxa"/>
+              <w:right w:w="108" w:type="dxa"/>
+            </w:tcMar>
+            <w:vAlign w:val="center"/>
+          </w:tcPr>
+          <w:p>
+            <w:pPr>
+              <w:rPr>
+                <w:rFonts w:ascii="Times New Roman" w:hAnsi="Times New Roman"/>
+                <w:color w:val="000000" w:themeColor="text1"/>
+                <w:sz w:val="14"/>
+                <w:szCs w:val="14"/>
+              </w:rPr>
+            </w:pPr>
+            <w:r>
+              <w:rPr>
+                <w:color w:val="000000" w:themeColor="text1"/>
+                <w:sz w:val="14"/>
+                <w:szCs w:val="14"/>
+                <w:rFonts w:ascii="Times New Roman" w:hAnsi="Times New Roman" w:cs="Times New Roman"/>
+              </w:rPr>
+              <w:t w:space="preserve" xml:space="preserve">N/A</w:t>
+            </w:r>
+            <w:r>
+              <w:rPr>
+                <w:color w:val="000000" w:themeColor="text1"/>
+                <w:sz w:val="14"/>
+                <w:szCs w:val="14"/>
+                <w:rFonts w:ascii="Times New Roman" w:hAnsi="Times New Roman" w:cs="Times New Roman"/>
+              </w:rPr>
+              <w:t/>
+            </w:r>
+            <w:r>
+              <w:rPr>
+                <w:color w:val="000000" w:themeColor="text1"/>
+                <w:sz w:val="14"/>
+                <w:szCs w:val="14"/>
+                <w:rFonts w:ascii="Times New Roman" w:hAnsi="Times New Roman" w:cs="Times New Roman"/>
+              </w:rPr>
+              <w:t xml:space="preserve"/>
+            </w:r>
+          </w:p>
+        </w:tc>
+        <w:tc>
+          <w:tcPr>
+            <w:tcW w:w="507" w:type="dxa"/>
+            <w:gridSpan w:val="2"/>
+            <w:tcBorders>
+              <w:top w:val="single" w:sz="8" w:space="0" w:color="auto"/>
+              <w:left w:val="single" w:sz="8" w:space="0" w:color="auto"/>
+              <w:bottom w:val="single" w:sz="8" w:space="0" w:color="auto"/>
+              <w:right w:val="single" w:sz="8" w:space="0" w:color="auto"/>
+            </w:tcBorders>
+            <w:shd w:val="clear" w:color="auto" w:fill="FFFFFF" w:themeFill="background1"/>
+            <w:tcMar>
+              <w:left w:w="108" w:type="dxa"/>
+              <w:right w:w="108" w:type="dxa"/>
+            </w:tcMar>
+            <w:vAlign w:val="center"/>
+          </w:tcPr>
+          <w:p>
+            <w:pPr>
+              <w:jc w:val="center"/>
+              <w:spacing w:before="0" w:after="0" w:line="240" w:lineRule="auto"/>
+              <w:rPr>
+                <w:rFonts w:ascii="Times New Roman" w:hAnsi="Times New Roman"/>
+                <w:sz w:val="14"/>
+                <w:szCs w:val="14"/>
+              </w:rPr>
+            </w:pPr>
+            <w:r>
+              <w:rPr>
+                <w:sz w:val="14"/>
+                <w:szCs w:val="14"/>
+                <w:rFonts w:ascii="Times New Roman" w:hAnsi="Times New Roman" w:cs="Times New Roman"/>
+              </w:rPr>
+              <w:t>None</w:t>
+            </w:r>
+          </w:p>
+        </w:tc>
+      </w:tr>
+      <w:tr>
+        <w:trPr>
+          <w:trHeight w:val="300"/>
+          <w:trHeight w:val="220" w:hRule="atLeast"/>
+        </w:trPr>
+        <w:tc>
+          <w:tcPr>
+            <w:tcW w:w="837" w:type="dxa"/>
+            <w:tcBorders>
+              <w:top w:val="single" w:sz="8" w:space="0" w:color="auto"/>
+              <w:left w:val="single" w:sz="8" w:space="0" w:color="auto"/>
+              <w:bottom w:val="single" w:sz="8" w:space="0" w:color="auto"/>
+              <w:right w:val="single" w:sz="8" w:space="0" w:color="auto"/>
+            </w:tcBorders>
+            <w:shd w:val="clear" w:color="auto" w:fill="FFFFFF" w:themeFill="background1"/>
+            <w:tcMar>
+              <w:left w:w="108" w:type="dxa"/>
+              <w:right w:w="108" w:type="dxa"/>
+            </w:tcMar>
+            <w:vAlign w:val="center"/>
+          </w:tcPr>
+          <w:p>
+            <w:pPr>
+              <w:jc w:val="center"/>
+            </w:pPr>
+            <w:r>
+              <w:rPr>
+                <w:color w:val="000000" w:themeColor="text1"/>
+                <w:sz w:val="14"/>
+                <w:szCs w:val="14"/>
+                <w:rFonts w:ascii="Times New Roman" w:hAnsi="Times New Roman" w:cs="Times New Roman"/>
+              </w:rPr>
+              <w:t>Surface Sampling of ISO 5 (4 locations)</w:t>
+            </w:r>
+          </w:p>
+        </w:tc>
+        <w:tc>
+          <w:tcPr>
+            <w:tcW w:w="698" w:type="dxa"/>
+            <w:gridSpan w:val="2"/>
+            <w:tcBorders>
+              <w:top w:val="single" w:sz="8" w:space="0" w:color="auto"/>
+              <w:left w:val="single" w:sz="8" w:space="0" w:color="auto"/>
+              <w:bottom w:val="single" w:sz="8" w:space="0" w:color="auto"/>
+              <w:right w:val="single" w:sz="8" w:space="0" w:color="auto"/>
+            </w:tcBorders>
+            <w:shd w:val="clear" w:color="auto" w:fill="FFFFFF" w:themeFill="background1"/>
+            <w:tcMar>
+              <w:left w:w="108" w:type="dxa"/>
+              <w:right w:w="108" w:type="dxa"/>
+            </w:tcMar>
+            <w:vAlign w:val="center"/>
+          </w:tcPr>
+          <w:p>
+            <w:pPr>
+              <w:jc w:val="center"/>
+            </w:pPr>
+            <w:r>
+              <w:rPr>
+                <w:color w:val="000000" w:themeColor="text1"/>
+                <w:sz w:val="14"/>
+                <w:szCs w:val="14"/>
+                <w:rFonts w:ascii="Times New Roman" w:hAnsi="Times New Roman" w:cs="Times New Roman"/>
+              </w:rPr>
+              <w:t xml:space="preserve">Daily</w:t>
+            </w:r>
+          </w:p>
+        </w:tc>
+        <w:tc>
+          <w:tcPr>
+            <w:tcW w:w="1206" w:type="dxa"/>
+            <w:tcBorders>
+              <w:top w:val="single" w:sz="8" w:space="0" w:color="auto"/>
+              <w:left w:val="nil"/>
+              <w:bottom w:val="single" w:sz="8" w:space="0" w:color="auto"/>
+              <w:right w:val="single" w:sz="8" w:space="0" w:color="auto"/>
+            </w:tcBorders>
+            <w:shd w:val="clear" w:color="auto" w:fill="FFFFFF" w:themeFill="background1"/>
+            <w:tcMar>
+              <w:left w:w="108" w:type="dxa"/>
+              <w:right w:w="108" w:type="dxa"/>
+            </w:tcMar>
+            <w:vAlign w:val="center"/>
+          </w:tcPr>
+          <w:p>
+            <w:pPr>
+              <w:jc w:val="center"/>
+              <w:spacing w:before="0" w:after="0" w:line="240" w:lineRule="auto"/>
+              <w:rPr>
+                <w:rFonts w:ascii="Times New Roman" w:hAnsi="Times New Roman"/>
+                <w:sz w:val="14"/>
+                <w:szCs w:val="14"/>
+              </w:rPr>
+            </w:pPr>
+            <w:r>
+              <w:rPr>
+                <w:sz w:val="14"/>
+                <w:szCs w:val="14"/>
+                <w:rFonts w:ascii="Times New Roman" w:hAnsi="Times New Roman" w:cs="Times New Roman"/>
+              </w:rPr>
+              <w:t>16Sep26</w:t>
+            </w:r>
+          </w:p>
+        </w:tc>
+        <w:tc>
+          <w:tcPr>
+            <w:tcW w:w="1168" w:type="dxa"/>
+            <w:gridSpan w:val="2"/>
+            <w:tcBorders>
+              <w:top w:val="single" w:sz="8" w:space="0" w:color="auto"/>
+              <w:left w:val="single" w:sz="8" w:space="0" w:color="auto"/>
+              <w:bottom w:val="single" w:sz="8" w:space="0" w:color="auto"/>
+              <w:right w:val="single" w:sz="8" w:space="0" w:color="auto"/>
+            </w:tcBorders>
+            <w:shd w:val="clear" w:color="auto" w:fill="FFFFFF" w:themeFill="background1"/>
+            <w:tcMar>
+              <w:left w:w="108" w:type="dxa"/>
+              <w:right w:w="108" w:type="dxa"/>
+            </w:tcMar>
+            <w:vAlign w:val="center"/>
+          </w:tcPr>
+          <w:p>
+            <w:pPr>
+              <w:jc w:val="center"/>
+              <w:spacing w:before="0" w:after="0" w:line="240" w:lineRule="auto"/>
+              <w:rPr>
+                <w:rFonts w:ascii="Times New Roman" w:hAnsi="Times New Roman"/>
+                <w:sz w:val="14"/>
+                <w:szCs w:val="14"/>
+              </w:rPr>
+            </w:pPr>
+            <w:r>
+              <w:rPr>
+                <w:sz w:val="14"/>
+                <w:szCs w:val="14"/>
+                <w:rFonts w:ascii="Times New Roman" w:hAnsi="Times New Roman" w:cs="Times New Roman"/>
+              </w:rPr>
+              <w:t>AO</w:t>
+            </w:r>
+          </w:p>
+        </w:tc>
+        <w:tc>
+          <w:tcPr>
+            <w:tcW w:w="581" w:type="dxa"/>
+            <w:tcBorders>
+              <w:top w:val="single" w:sz="8" w:space="0" w:color="auto"/>
+              <w:left w:val="nil"/>
+              <w:bottom w:val="single" w:sz="8" w:space="0" w:color="auto"/>
+              <w:right w:val="single" w:sz="8" w:space="0" w:color="auto"/>
+            </w:tcBorders>
+            <w:shd w:val="clear" w:color="auto" w:fill="FFFFFF" w:themeFill="background1"/>
+            <w:tcMar>
+              <w:left w:w="108" w:type="dxa"/>
+              <w:right w:w="108" w:type="dxa"/>
+            </w:tcMar>
+            <w:vAlign w:val="center"/>
+          </w:tcPr>
+          <w:p>
+            <w:pPr>
+              <w:jc w:val="center"/>
+            </w:pPr>
+            <w:r>
+              <w:rPr>
+                <w:color w:val="000000" w:themeColor="text1"/>
+                <w:sz w:val="14"/>
+                <w:szCs w:val="14"/>
+                <w:rFonts w:ascii="Times New Roman" w:hAnsi="Times New Roman" w:cs="Times New Roman"/>
+              </w:rPr>
+              <w:t xml:space="preserve">Date After Testing</w:t>
+            </w:r>
+          </w:p>
+        </w:tc>
+        <w:tc>
+          <w:tcPr>
+            <w:tcW w:w="1505" w:type="dxa"/>
+            <w:gridSpan w:val="2"/>
+            <w:tcBorders>
+              <w:top w:val="single" w:sz="8" w:space="0" w:color="auto"/>
+              <w:left w:val="single" w:sz="8" w:space="0" w:color="auto"/>
+              <w:bottom w:val="single" w:sz="8" w:space="0" w:color="auto"/>
+              <w:right w:val="single" w:sz="8" w:space="0" w:color="auto"/>
+            </w:tcBorders>
+            <w:shd w:val="clear" w:color="auto" w:fill="FFFFFF" w:themeFill="background1"/>
+            <w:tcMar>
+              <w:left w:w="108" w:type="dxa"/>
+              <w:right w:w="108" w:type="dxa"/>
+            </w:tcMar>
+            <w:vAlign w:val="center"/>
+          </w:tcPr>
+          <w:p>
+            <w:pPr>
+              <w:jc w:val="center"/>
+              <w:spacing w:before="0" w:after="0" w:line="240" w:lineRule="auto"/>
+              <w:rPr>
+                <w:rFonts w:ascii="Times New Roman" w:hAnsi="Times New Roman"/>
+                <w:sz w:val="14"/>
+                <w:szCs w:val="14"/>
+              </w:rPr>
+            </w:pPr>
+            <w:r>
+              <w:rPr>
+                <w:sz w:val="14"/>
+                <w:szCs w:val="14"/>
+                <w:rFonts w:ascii="Times New Roman" w:hAnsi="Times New Roman" w:cs="Times New Roman"/>
+              </w:rPr>
+              <w:t>No growth</w:t>
+            </w:r>
+          </w:p>
+        </w:tc>
+        <w:tc>
+          <w:tcPr>
+            <w:tcW w:w="1444" w:type="dxa"/>
+            <w:tcBorders>
+              <w:top w:val="single" w:sz="8" w:space="0" w:color="auto"/>
+              <w:left w:val="nil"/>
+              <w:bottom w:val="single" w:sz="8" w:space="0" w:color="auto"/>
+              <w:right w:val="single" w:sz="8" w:space="0" w:color="auto"/>
+            </w:tcBorders>
+            <w:shd w:val="clear" w:color="auto" w:fill="FFFFFF" w:themeFill="background1"/>
+            <w:tcMar>
+              <w:left w:w="108" w:type="dxa"/>
+              <w:right w:w="108" w:type="dxa"/>
+            </w:tcMar>
+            <w:vAlign w:val="center"/>
+          </w:tcPr>
+          <w:p>
+            <w:pPr>
+              <w:jc w:val="center"/>
+              <w:spacing w:before="0" w:after="0" w:line="240" w:lineRule="auto"/>
+              <w:rPr>
+                <w:rFonts w:ascii="Times New Roman" w:hAnsi="Times New Roman"/>
+                <w:sz w:val="14"/>
+                <w:szCs w:val="14"/>
+              </w:rPr>
+            </w:pPr>
+            <w:r>
+              <w:rPr>
+                <w:sz w:val="14"/>
+                <w:szCs w:val="14"/>
+                <w:rFonts w:ascii="Times New Roman" w:hAnsi="Times New Roman" w:cs="Times New Roman"/>
+              </w:rPr>
+              <w:t>N/A</w:t>
+            </w:r>
+          </w:p>
+        </w:tc>
+        <w:tc>
+          <w:tcPr>
+            <w:tcW w:w="1394" w:type="dxa"/>
+            <w:tcBorders>
+              <w:top w:val="single" w:sz="8" w:space="0" w:color="auto"/>
+              <w:left w:val="single" w:sz="8" w:space="0" w:color="auto"/>
+              <w:bottom w:val="single" w:sz="8" w:space="0" w:color="auto"/>
+              <w:right w:val="single" w:sz="8" w:space="0" w:color="auto"/>
+            </w:tcBorders>
+            <w:shd w:val="clear" w:color="auto" w:fill="FFFFFF" w:themeFill="background1"/>
+            <w:tcMar>
+              <w:left w:w="108" w:type="dxa"/>
+              <w:right w:w="108" w:type="dxa"/>
+            </w:tcMar>
+            <w:vAlign w:val="center"/>
+          </w:tcPr>
+          <w:p>
+            <w:r>
+              <w:rPr>
+                <w:color w:val="000000" w:themeColor="text1"/>
+                <w:sz w:val="14"/>
+                <w:szCs w:val="14"/>
+                <w:rFonts w:ascii="Times New Roman" w:hAnsi="Times New Roman" w:cs="Times New Roman"/>
+              </w:rPr>
+              <w:t xml:space="preserve" w:space="preserve">N/A</w:t>
+            </w:r>
+            <w:r>
+              <w:rPr>
+                <w:color w:val="000000" w:themeColor="text1"/>
+                <w:sz w:val="14"/>
+                <w:szCs w:val="14"/>
+                <w:rFonts w:ascii="Times New Roman" w:hAnsi="Times New Roman" w:cs="Times New Roman"/>
+              </w:rPr>
+              <w:t/>
+            </w:r>
+            <w:r>
+              <w:rPr>
+                <w:color w:val="000000" w:themeColor="text1"/>
+                <w:sz w:val="14"/>
+                <w:szCs w:val="14"/>
+                <w:rFonts w:ascii="Times New Roman" w:hAnsi="Times New Roman" w:cs="Times New Roman"/>
+              </w:rPr>
+              <w:t/>
+            </w:r>
+            <w:r>
+              <w:rPr>
+                <w:color w:val="000000" w:themeColor="text1"/>
+                <w:sz w:val="14"/>
+                <w:szCs w:val="14"/>
+                <w:rFonts w:ascii="Times New Roman" w:hAnsi="Times New Roman" w:cs="Times New Roman"/>
+              </w:rPr>
+              <w:t/>
+            </w:r>
+            <w:r>
+              <w:rPr>
+                <w:color w:val="000000" w:themeColor="text1"/>
+                <w:sz w:val="14"/>
+                <w:szCs w:val="14"/>
+                <w:rFonts w:ascii="Times New Roman" w:hAnsi="Times New Roman" w:cs="Times New Roman"/>
+              </w:rPr>
+              <w:t xml:space="preserve"/>
+            </w:r>
+          </w:p>
+        </w:tc>
+        <w:tc>
+          <w:tcPr>
+            <w:tcW w:w="507" w:type="dxa"/>
+            <w:gridSpan w:val="2"/>
+            <w:tcBorders>
+              <w:top w:val="single" w:sz="8" w:space="0" w:color="auto"/>
+              <w:left w:val="single" w:sz="8" w:space="0" w:color="auto"/>
+              <w:bottom w:val="single" w:sz="8" w:space="0" w:color="auto"/>
+              <w:right w:val="single" w:sz="8" w:space="0" w:color="auto"/>
+            </w:tcBorders>
+            <w:shd w:val="clear" w:color="auto" w:fill="FFFFFF" w:themeFill="background1"/>
+            <w:tcMar>
+              <w:left w:w="108" w:type="dxa"/>
+              <w:right w:w="108" w:type="dxa"/>
+            </w:tcMar>
+            <w:vAlign w:val="center"/>
+          </w:tcPr>
+          <w:p>
+            <w:pPr>
+              <w:jc w:val="center"/>
+              <w:spacing w:before="0" w:after="0" w:line="240" w:lineRule="auto"/>
+              <w:rPr>
+                <w:rFonts w:ascii="Times New Roman" w:hAnsi="Times New Roman"/>
+                <w:sz w:val="14"/>
+                <w:szCs w:val="14"/>
+              </w:rPr>
+            </w:pPr>
+            <w:r>
+              <w:rPr>
+                <w:sz w:val="14"/>
+                <w:szCs w:val="14"/>
+                <w:rFonts w:ascii="Times New Roman" w:hAnsi="Times New Roman" w:cs="Times New Roman"/>
+              </w:rPr>
+              <w:t>None</w:t>
+            </w:r>
+          </w:p>
+        </w:tc>
+      </w:tr>
+      <w:tr>
+        <w:trPr>
+          <w:trHeight w:val="300"/>
+          <w:trHeight w:val="220" w:hRule="atLeast"/>
+        </w:trPr>
+        <w:tc>
+          <w:tcPr>
+            <w:tcW w:w="837" w:type="dxa"/>
+            <w:tcBorders>
+              <w:top w:val="single" w:sz="8" w:space="0" w:color="auto"/>
+              <w:left w:val="single" w:sz="8" w:space="0" w:color="auto"/>
+              <w:bottom w:val="single" w:sz="8" w:space="0" w:color="auto"/>
+              <w:right w:val="single" w:sz="8" w:space="0" w:color="auto"/>
+            </w:tcBorders>
+            <w:shd w:val="clear" w:color="auto" w:fill="FFFFFF" w:themeFill="background1"/>
+            <w:tcMar>
+              <w:left w:w="108" w:type="dxa"/>
+              <w:right w:w="108" w:type="dxa"/>
+            </w:tcMar>
+            <w:vAlign w:val="center"/>
+          </w:tcPr>
+          <w:p>
+            <w:pPr>
+              <w:jc w:val="center"/>
+            </w:pPr>
+            <w:r>
+              <w:rPr>
+                <w:color w:val="000000" w:themeColor="text1"/>
+                <w:sz w:val="14"/>
+                <w:szCs w:val="14"/>
+                <w:rFonts w:ascii="Times New Roman" w:hAnsi="Times New Roman" w:cs="Times New Roman"/>
+              </w:rPr>
+              <w:t>Settling Sampling of ISO 5 (2 locations)</w:t>
+            </w:r>
+          </w:p>
+        </w:tc>
+        <w:tc>
+          <w:tcPr>
+            <w:tcW w:w="698" w:type="dxa"/>
+            <w:gridSpan w:val="2"/>
+            <w:tcBorders>
+              <w:top w:val="single" w:sz="8" w:space="0" w:color="auto"/>
+              <w:left w:val="single" w:sz="8" w:space="0" w:color="auto"/>
+              <w:bottom w:val="single" w:sz="8" w:space="0" w:color="auto"/>
+              <w:right w:val="single" w:sz="8" w:space="0" w:color="auto"/>
+            </w:tcBorders>
+            <w:shd w:val="clear" w:color="auto" w:fill="FFFFFF" w:themeFill="background1"/>
+            <w:tcMar>
+              <w:left w:w="108" w:type="dxa"/>
+              <w:right w:w="108" w:type="dxa"/>
+            </w:tcMar>
+            <w:vAlign w:val="center"/>
+          </w:tcPr>
+          <w:p>
+            <w:pPr>
+              <w:jc w:val="center"/>
+            </w:pPr>
+            <w:r>
+              <w:rPr>
+                <w:color w:val="000000" w:themeColor="text1"/>
+                <w:sz w:val="14"/>
+                <w:szCs w:val="14"/>
+                <w:rFonts w:ascii="Times New Roman" w:hAnsi="Times New Roman" w:cs="Times New Roman"/>
+              </w:rPr>
+              <w:t xml:space="preserve">Daily</w:t>
+            </w:r>
+          </w:p>
+        </w:tc>
+        <w:tc>
+          <w:tcPr>
+            <w:tcW w:w="1206" w:type="dxa"/>
+            <w:tcBorders>
+              <w:top w:val="single" w:sz="8" w:space="0" w:color="auto"/>
+              <w:left w:val="nil"/>
+              <w:bottom w:val="single" w:sz="8" w:space="0" w:color="auto"/>
+              <w:right w:val="single" w:sz="8" w:space="0" w:color="auto"/>
+            </w:tcBorders>
+            <w:shd w:val="clear" w:color="auto" w:fill="FFFFFF" w:themeFill="background1"/>
+            <w:tcMar>
+              <w:left w:w="108" w:type="dxa"/>
+              <w:right w:w="108" w:type="dxa"/>
+            </w:tcMar>
+            <w:vAlign w:val="center"/>
+          </w:tcPr>
+          <w:p>
+            <w:pPr>
+              <w:jc w:val="center"/>
+              <w:spacing w:before="0" w:after="0" w:line="240" w:lineRule="auto"/>
+              <w:rPr>
+                <w:rFonts w:ascii="Times New Roman" w:hAnsi="Times New Roman"/>
+                <w:sz w:val="14"/>
+                <w:szCs w:val="14"/>
+              </w:rPr>
+            </w:pPr>
+            <w:r>
+              <w:rPr>
+                <w:sz w:val="14"/>
+                <w:szCs w:val="14"/>
+                <w:rFonts w:ascii="Times New Roman" w:hAnsi="Times New Roman" w:cs="Times New Roman"/>
+              </w:rPr>
+              <w:t>10Sep26</w:t>
+            </w:r>
+          </w:p>
+        </w:tc>
+        <w:tc>
+          <w:tcPr>
+            <w:tcW w:w="1168" w:type="dxa"/>
+            <w:gridSpan w:val="2"/>
+            <w:tcBorders>
+              <w:top w:val="single" w:sz="8" w:space="0" w:color="auto"/>
+              <w:left w:val="single" w:sz="8" w:space="0" w:color="auto"/>
+              <w:bottom w:val="single" w:sz="8" w:space="0" w:color="auto"/>
+              <w:right w:val="single" w:sz="8" w:space="0" w:color="auto"/>
+            </w:tcBorders>
+            <w:shd w:val="clear" w:color="auto" w:fill="FFFFFF" w:themeFill="background1"/>
+            <w:tcMar>
+              <w:left w:w="108" w:type="dxa"/>
+              <w:right w:w="108" w:type="dxa"/>
+            </w:tcMar>
+            <w:vAlign w:val="center"/>
+          </w:tcPr>
+          <w:p>
+            <w:pPr>
+              <w:jc w:val="center"/>
+              <w:spacing w:before="0" w:after="0" w:line="240" w:lineRule="auto"/>
+              <w:rPr>
+                <w:rFonts w:ascii="Times New Roman" w:hAnsi="Times New Roman"/>
+                <w:sz w:val="14"/>
+                <w:szCs w:val="14"/>
+              </w:rPr>
+            </w:pPr>
+            <w:r>
+              <w:rPr>
+                <w:sz w:val="14"/>
+                <w:szCs w:val="14"/>
+                <w:rFonts w:ascii="Times New Roman" w:hAnsi="Times New Roman" w:cs="Times New Roman"/>
+              </w:rPr>
+              <w:t>AO</w:t>
+            </w:r>
+          </w:p>
+        </w:tc>
+        <w:tc>
+          <w:tcPr>
+            <w:tcW w:w="581" w:type="dxa"/>
+            <w:tcBorders>
+              <w:top w:val="single" w:sz="8" w:space="0" w:color="auto"/>
+              <w:left w:val="nil"/>
+              <w:bottom w:val="single" w:sz="8" w:space="0" w:color="auto"/>
+              <w:right w:val="single" w:sz="8" w:space="0" w:color="auto"/>
+            </w:tcBorders>
+            <w:shd w:val="clear" w:color="auto" w:fill="FFFFFF" w:themeFill="background1"/>
+            <w:tcMar>
+              <w:left w:w="108" w:type="dxa"/>
+              <w:right w:w="108" w:type="dxa"/>
+            </w:tcMar>
+            <w:vAlign w:val="center"/>
+          </w:tcPr>
+          <w:p>
+            <w:pPr>
+              <w:jc w:val="center"/>
+            </w:pPr>
+            <w:r>
+              <w:rPr>
+                <w:color w:val="000000" w:themeColor="text1"/>
+                <w:sz w:val="14"/>
+                <w:szCs w:val="14"/>
+                <w:rFonts w:ascii="Times New Roman" w:hAnsi="Times New Roman" w:cs="Times New Roman"/>
+              </w:rPr>
+              <w:t xml:space="preserve">Date Before Testing</w:t>
+            </w:r>
+          </w:p>
+        </w:tc>
+        <w:tc>
+          <w:tcPr>
+            <w:tcW w:w="1505" w:type="dxa"/>
+            <w:gridSpan w:val="2"/>
+            <w:tcBorders>
+              <w:top w:val="single" w:sz="8" w:space="0" w:color="auto"/>
+              <w:left w:val="single" w:sz="8" w:space="0" w:color="auto"/>
+              <w:bottom w:val="single" w:sz="8" w:space="0" w:color="auto"/>
+              <w:right w:val="single" w:sz="8" w:space="0" w:color="auto"/>
+            </w:tcBorders>
+            <w:shd w:val="clear" w:color="auto" w:fill="FFFFFF" w:themeFill="background1"/>
+            <w:tcMar>
+              <w:left w:w="108" w:type="dxa"/>
+              <w:right w:w="108" w:type="dxa"/>
+            </w:tcMar>
+            <w:vAlign w:val="center"/>
+          </w:tcPr>
+          <w:p>
+            <w:pPr>
+              <w:jc w:val="center"/>
+              <w:spacing w:before="0" w:after="0" w:line="240" w:lineRule="auto"/>
+              <w:rPr>
+                <w:rFonts w:ascii="Times New Roman" w:hAnsi="Times New Roman"/>
+                <w:sz w:val="14"/>
+                <w:szCs w:val="14"/>
+              </w:rPr>
+            </w:pPr>
+            <w:r>
+              <w:rPr>
+                <w:sz w:val="14"/>
+                <w:szCs w:val="14"/>
+                <w:rFonts w:ascii="Times New Roman" w:hAnsi="Times New Roman" w:cs="Times New Roman"/>
+              </w:rPr>
+              <w:t>No growth</w:t>
+            </w:r>
+          </w:p>
+        </w:tc>
+        <w:tc>
+          <w:tcPr>
+            <w:tcW w:w="1444" w:type="dxa"/>
+            <w:tcBorders>
+              <w:top w:val="single" w:sz="8" w:space="0" w:color="auto"/>
+              <w:left w:val="nil"/>
+              <w:bottom w:val="single" w:sz="8" w:space="0" w:color="auto"/>
+              <w:right w:val="single" w:sz="8" w:space="0" w:color="auto"/>
+            </w:tcBorders>
+            <w:shd w:val="clear" w:color="auto" w:fill="FFFFFF" w:themeFill="background1"/>
+            <w:tcMar>
+              <w:left w:w="108" w:type="dxa"/>
+              <w:right w:w="108" w:type="dxa"/>
+            </w:tcMar>
+            <w:vAlign w:val="center"/>
+          </w:tcPr>
+          <w:p>
+            <w:pPr>
+              <w:jc w:val="center"/>
+              <w:spacing w:before="0" w:after="0" w:line="240" w:lineRule="auto"/>
+              <w:rPr>
+                <w:rFonts w:ascii="Times New Roman" w:hAnsi="Times New Roman"/>
+                <w:sz w:val="14"/>
+                <w:szCs w:val="14"/>
+              </w:rPr>
+            </w:pPr>
+            <w:r>
+              <w:rPr>
+                <w:sz w:val="14"/>
+                <w:szCs w:val="14"/>
+                <w:rFonts w:ascii="Times New Roman" w:hAnsi="Times New Roman" w:cs="Times New Roman"/>
+              </w:rPr>
+              <w:t>N/A</w:t>
+            </w:r>
+          </w:p>
+        </w:tc>
+        <w:tc>
+          <w:tcPr>
+            <w:tcW w:w="1394" w:type="dxa"/>
+            <w:tcBorders>
+              <w:top w:val="single" w:sz="8" w:space="0" w:color="auto"/>
+              <w:left w:val="single" w:sz="8" w:space="0" w:color="auto"/>
+              <w:bottom w:val="single" w:sz="8" w:space="0" w:color="auto"/>
+              <w:right w:val="single" w:sz="8" w:space="0" w:color="auto"/>
+            </w:tcBorders>
+            <w:shd w:val="clear" w:color="auto" w:fill="FFFFFF" w:themeFill="background1"/>
+            <w:tcMar>
+              <w:left w:w="108" w:type="dxa"/>
+              <w:right w:w="108" w:type="dxa"/>
+            </w:tcMar>
+            <w:vAlign w:val="center"/>
+          </w:tcPr>
+          <w:p>
+            <w:r>
+              <w:rPr>
+                <w:color w:val="000000" w:themeColor="text1"/>
+                <w:sz w:val="14"/>
+                <w:szCs w:val="14"/>
+                <w:rFonts w:ascii="Times New Roman" w:hAnsi="Times New Roman" w:cs="Times New Roman"/>
+              </w:rPr>
+              <w:t xml:space="preserve" w:space="preserve">N/A</w:t>
+            </w:r>
+            <w:r>
+              <w:rPr>
+                <w:color w:val="000000" w:themeColor="text1"/>
+                <w:sz w:val="14"/>
+                <w:szCs w:val="14"/>
+                <w:lang w:eastAsia="zh-CN"/>
+                <w:rFonts w:ascii="Times New Roman" w:hAnsi="Times New Roman" w:cs="Times New Roman"/>
+              </w:rPr>
+              <w:t/>
+            </w:r>
+            <w:r>
+              <w:rPr>
+                <w:color w:val="000000" w:themeColor="text1"/>
+                <w:sz w:val="14"/>
+                <w:szCs w:val="14"/>
+                <w:rFonts w:ascii="Times New Roman" w:hAnsi="Times New Roman" w:cs="Times New Roman"/>
+              </w:rPr>
+              <w:t/>
+            </w:r>
+            <w:r>
+              <w:rPr>
+                <w:color w:val="000000" w:themeColor="text1"/>
+                <w:sz w:val="14"/>
+                <w:szCs w:val="14"/>
+                <w:rFonts w:ascii="Times New Roman" w:hAnsi="Times New Roman" w:cs="Times New Roman"/>
+              </w:rPr>
+              <w:t/>
+            </w:r>
+            <w:r>
+              <w:rPr>
+                <w:color w:val="000000" w:themeColor="text1"/>
+                <w:sz w:val="14"/>
+                <w:szCs w:val="14"/>
+                <w:rFonts w:ascii="Times New Roman" w:hAnsi="Times New Roman" w:cs="Times New Roman"/>
+              </w:rPr>
+              <w:t xml:space="preserve"/>
+            </w:r>
+          </w:p>
+        </w:tc>
+        <w:tc>
+          <w:tcPr>
+            <w:tcW w:w="507" w:type="dxa"/>
+            <w:gridSpan w:val="2"/>
+            <w:tcBorders>
+              <w:top w:val="single" w:sz="8" w:space="0" w:color="auto"/>
+              <w:left w:val="single" w:sz="8" w:space="0" w:color="auto"/>
+              <w:bottom w:val="single" w:sz="8" w:space="0" w:color="auto"/>
+              <w:right w:val="single" w:sz="8" w:space="0" w:color="auto"/>
+            </w:tcBorders>
+            <w:shd w:val="clear" w:color="auto" w:fill="FFFFFF" w:themeFill="background1"/>
+            <w:tcMar>
+              <w:left w:w="108" w:type="dxa"/>
+              <w:right w:w="108" w:type="dxa"/>
+            </w:tcMar>
+            <w:vAlign w:val="center"/>
+          </w:tcPr>
+          <w:p>
+            <w:pPr>
+              <w:jc w:val="center"/>
+              <w:spacing w:before="0" w:after="0" w:line="240" w:lineRule="auto"/>
+              <w:rPr>
+                <w:rFonts w:ascii="Times New Roman" w:hAnsi="Times New Roman"/>
+                <w:sz w:val="14"/>
+                <w:szCs w:val="14"/>
+              </w:rPr>
+            </w:pPr>
+            <w:r>
+              <w:rPr>
+                <w:sz w:val="14"/>
+                <w:szCs w:val="14"/>
+                <w:rFonts w:ascii="Times New Roman" w:hAnsi="Times New Roman" w:cs="Times New Roman"/>
+              </w:rPr>
+              <w:t>None</w:t>
+            </w:r>
+          </w:p>
+        </w:tc>
+      </w:tr>
+      <w:tr>
+        <w:trPr>
+          <w:trHeight w:val="300"/>
+          <w:trHeight w:val="220" w:hRule="atLeast"/>
+        </w:trPr>
+        <w:tc>
+          <w:tcPr>
+            <w:tcW w:w="837" w:type="dxa"/>
+            <w:tcBorders>
+              <w:top w:val="single" w:sz="8" w:space="0" w:color="auto"/>
+              <w:left w:val="single" w:sz="8" w:space="0" w:color="auto"/>
+              <w:bottom w:val="single" w:sz="8" w:space="0" w:color="auto"/>
+              <w:right w:val="single" w:sz="8" w:space="0" w:color="auto"/>
+            </w:tcBorders>
+            <w:shd w:val="clear" w:color="auto" w:fill="FFFFFF" w:themeFill="background1"/>
+            <w:tcMar>
+              <w:left w:w="108" w:type="dxa"/>
+              <w:right w:w="108" w:type="dxa"/>
+            </w:tcMar>
+            <w:vAlign w:val="center"/>
+          </w:tcPr>
+          <w:p>
+            <w:pPr>
+              <w:jc w:val="center"/>
+            </w:pPr>
+            <w:r>
+              <w:rPr>
+                <w:color w:val="000000" w:themeColor="text1"/>
+                <w:sz w:val="14"/>
+                <w:szCs w:val="14"/>
+                <w:rFonts w:ascii="Times New Roman" w:hAnsi="Times New Roman" w:cs="Times New Roman"/>
+              </w:rPr>
+              <w:t>Settling Sampling of ISO 5 (2 locations)</w:t>
+            </w:r>
+          </w:p>
+        </w:tc>
+        <w:tc>
+          <w:tcPr>
+            <w:tcW w:w="698" w:type="dxa"/>
+            <w:gridSpan w:val="2"/>
+            <w:tcBorders>
+              <w:top w:val="single" w:sz="8" w:space="0" w:color="auto"/>
+              <w:left w:val="single" w:sz="8" w:space="0" w:color="auto"/>
+              <w:bottom w:val="single" w:sz="8" w:space="0" w:color="auto"/>
+              <w:right w:val="single" w:sz="8" w:space="0" w:color="auto"/>
+            </w:tcBorders>
+            <w:shd w:val="clear" w:color="auto" w:fill="FFFFFF" w:themeFill="background1"/>
+            <w:tcMar>
+              <w:left w:w="108" w:type="dxa"/>
+              <w:right w:w="108" w:type="dxa"/>
+            </w:tcMar>
+            <w:vAlign w:val="center"/>
+          </w:tcPr>
+          <w:p>
+            <w:pPr>
+              <w:jc w:val="center"/>
+            </w:pPr>
+            <w:r>
+              <w:rPr>
+                <w:color w:val="000000" w:themeColor="text1"/>
+                <w:sz w:val="14"/>
+                <w:szCs w:val="14"/>
+                <w:rFonts w:ascii="Times New Roman" w:hAnsi="Times New Roman" w:cs="Times New Roman"/>
+              </w:rPr>
+              <w:t xml:space="preserve">Daily</w:t>
+            </w:r>
+          </w:p>
+        </w:tc>
+        <w:tc>
+          <w:tcPr>
+            <w:tcW w:w="1206" w:type="dxa"/>
+            <w:tcBorders>
+              <w:top w:val="single" w:sz="8" w:space="0" w:color="auto"/>
+              <w:left w:val="nil"/>
+              <w:bottom w:val="single" w:sz="8" w:space="0" w:color="auto"/>
+              <w:right w:val="single" w:sz="8" w:space="0" w:color="auto"/>
+            </w:tcBorders>
+            <w:shd w:val="clear" w:color="auto" w:fill="FFFFFF" w:themeFill="background1"/>
+            <w:tcMar>
+              <w:left w:w="108" w:type="dxa"/>
+              <w:right w:w="108" w:type="dxa"/>
+            </w:tcMar>
+            <w:vAlign w:val="center"/>
+          </w:tcPr>
+          <w:p>
+            <w:pPr>
+              <w:jc w:val="center"/>
+              <w:spacing w:before="0" w:after="0" w:line="240" w:lineRule="auto"/>
+              <w:rPr>
+                <w:rFonts w:ascii="Times New Roman" w:hAnsi="Times New Roman"/>
+                <w:sz w:val="14"/>
+                <w:szCs w:val="14"/>
+              </w:rPr>
+            </w:pPr>
+            <w:r>
+              <w:rPr>
+                <w:sz w:val="14"/>
+                <w:szCs w:val="14"/>
+                <w:rFonts w:ascii="Times New Roman" w:hAnsi="Times New Roman" w:cs="Times New Roman"/>
+              </w:rPr>
+              <w:t>15Sep26</w:t>
+            </w:r>
+          </w:p>
+        </w:tc>
+        <w:tc>
+          <w:tcPr>
+            <w:tcW w:w="1168" w:type="dxa"/>
+            <w:gridSpan w:val="2"/>
+            <w:tcBorders>
+              <w:top w:val="single" w:sz="8" w:space="0" w:color="auto"/>
+              <w:left w:val="single" w:sz="8" w:space="0" w:color="auto"/>
+              <w:bottom w:val="single" w:sz="8" w:space="0" w:color="auto"/>
+              <w:right w:val="single" w:sz="8" w:space="0" w:color="auto"/>
+            </w:tcBorders>
+            <w:shd w:val="clear" w:color="auto" w:fill="FFFFFF" w:themeFill="background1"/>
+            <w:tcMar>
+              <w:left w:w="108" w:type="dxa"/>
+              <w:right w:w="108" w:type="dxa"/>
+            </w:tcMar>
+            <w:vAlign w:val="center"/>
+          </w:tcPr>
+          <w:p>
+            <w:pPr>
+              <w:jc w:val="center"/>
+              <w:spacing w:before="0" w:after="0" w:line="240" w:lineRule="auto"/>
+              <w:rPr>
+                <w:rFonts w:ascii="Times New Roman" w:hAnsi="Times New Roman"/>
+                <w:sz w:val="14"/>
+                <w:szCs w:val="14"/>
+              </w:rPr>
+            </w:pPr>
+            <w:r>
+              <w:rPr>
+                <w:sz w:val="14"/>
+                <w:szCs w:val="14"/>
+                <w:rFonts w:ascii="Times New Roman" w:hAnsi="Times New Roman" w:cs="Times New Roman"/>
+              </w:rPr>
+              <w:t>AO</w:t>
+            </w:r>
+          </w:p>
+        </w:tc>
+        <w:tc>
+          <w:tcPr>
+            <w:tcW w:w="581" w:type="dxa"/>
+            <w:tcBorders>
+              <w:top w:val="single" w:sz="8" w:space="0" w:color="auto"/>
+              <w:left w:val="nil"/>
+              <w:bottom w:val="single" w:sz="8" w:space="0" w:color="auto"/>
+              <w:right w:val="single" w:sz="8" w:space="0" w:color="auto"/>
+            </w:tcBorders>
+            <w:shd w:val="clear" w:color="auto" w:fill="FFFFFF" w:themeFill="background1"/>
+            <w:tcMar>
+              <w:left w:w="108" w:type="dxa"/>
+              <w:right w:w="108" w:type="dxa"/>
+            </w:tcMar>
+            <w:vAlign w:val="center"/>
+          </w:tcPr>
+          <w:p>
+            <w:pPr>
+              <w:jc w:val="center"/>
+            </w:pPr>
+            <w:r>
+              <w:rPr>
+                <w:color w:val="000000" w:themeColor="text1"/>
+                <w:sz w:val="14"/>
+                <w:szCs w:val="14"/>
+                <w:rFonts w:ascii="Times New Roman" w:hAnsi="Times New Roman" w:cs="Times New Roman"/>
+              </w:rPr>
+              <w:t xml:space="preserve">Date of Testing</w:t>
+            </w:r>
+          </w:p>
+        </w:tc>
+        <w:tc>
+          <w:tcPr>
+            <w:tcW w:w="1505" w:type="dxa"/>
+            <w:gridSpan w:val="2"/>
+            <w:tcBorders>
+              <w:top w:val="single" w:sz="8" w:space="0" w:color="auto"/>
+              <w:left w:val="single" w:sz="8" w:space="0" w:color="auto"/>
+              <w:bottom w:val="single" w:sz="8" w:space="0" w:color="auto"/>
+              <w:right w:val="single" w:sz="8" w:space="0" w:color="auto"/>
+            </w:tcBorders>
+            <w:shd w:val="clear" w:color="auto" w:fill="FFFFFF" w:themeFill="background1"/>
+            <w:tcMar>
+              <w:left w:w="108" w:type="dxa"/>
+              <w:right w:w="108" w:type="dxa"/>
+            </w:tcMar>
+            <w:vAlign w:val="center"/>
+          </w:tcPr>
+          <w:p>
+            <w:pPr>
+              <w:jc w:val="center"/>
+              <w:spacing w:before="0" w:after="0" w:line="240" w:lineRule="auto"/>
+              <w:rPr>
+                <w:rFonts w:ascii="Times New Roman" w:hAnsi="Times New Roman"/>
+                <w:sz w:val="14"/>
+                <w:szCs w:val="14"/>
+              </w:rPr>
+            </w:pPr>
+            <w:r>
+              <w:rPr>
+                <w:sz w:val="14"/>
+                <w:szCs w:val="14"/>
+                <w:rFonts w:ascii="Times New Roman" w:hAnsi="Times New Roman" w:cs="Times New Roman"/>
+              </w:rPr>
+              <w:t>No growth</w:t>
+            </w:r>
+          </w:p>
+        </w:tc>
+        <w:tc>
+          <w:tcPr>
+            <w:tcW w:w="1444" w:type="dxa"/>
+            <w:tcBorders>
+              <w:top w:val="single" w:sz="8" w:space="0" w:color="auto"/>
+              <w:left w:val="nil"/>
+              <w:bottom w:val="single" w:sz="8" w:space="0" w:color="auto"/>
+              <w:right w:val="single" w:sz="8" w:space="0" w:color="auto"/>
+            </w:tcBorders>
+            <w:shd w:val="clear" w:color="auto" w:fill="FFFFFF" w:themeFill="background1"/>
+            <w:tcMar>
+              <w:left w:w="108" w:type="dxa"/>
+              <w:right w:w="108" w:type="dxa"/>
+            </w:tcMar>
+            <w:vAlign w:val="center"/>
+          </w:tcPr>
+          <w:p>
+            <w:pPr>
+              <w:jc w:val="center"/>
+              <w:spacing w:before="0" w:after="0" w:line="240" w:lineRule="auto"/>
+              <w:rPr>
+                <w:rFonts w:ascii="Times New Roman" w:hAnsi="Times New Roman"/>
+                <w:sz w:val="14"/>
+                <w:szCs w:val="14"/>
+              </w:rPr>
+            </w:pPr>
+            <w:r>
+              <w:rPr>
+                <w:sz w:val="14"/>
+                <w:szCs w:val="14"/>
+                <w:rFonts w:ascii="Times New Roman" w:hAnsi="Times New Roman" w:cs="Times New Roman"/>
+              </w:rPr>
+              <w:t>N/A</w:t>
+            </w:r>
+          </w:p>
+        </w:tc>
+        <w:tc>
+          <w:tcPr>
+            <w:tcW w:w="1394" w:type="dxa"/>
+            <w:tcBorders>
+              <w:top w:val="single" w:sz="8" w:space="0" w:color="auto"/>
+              <w:left w:val="single" w:sz="8" w:space="0" w:color="auto"/>
+              <w:bottom w:val="single" w:sz="8" w:space="0" w:color="auto"/>
+              <w:right w:val="single" w:sz="8" w:space="0" w:color="auto"/>
+            </w:tcBorders>
+            <w:shd w:val="clear" w:color="auto" w:fill="FFFFFF" w:themeFill="background1"/>
+            <w:tcMar>
+              <w:left w:w="108" w:type="dxa"/>
+              <w:right w:w="108" w:type="dxa"/>
+            </w:tcMar>
+            <w:vAlign w:val="center"/>
+          </w:tcPr>
+          <w:p>
+            <w:pPr>
+              <w:rPr>
+                <w:rFonts w:ascii="Times New Roman" w:hAnsi="Times New Roman"/>
+                <w:color w:val="000000" w:themeColor="text1"/>
+                <w:sz w:val="14"/>
+                <w:szCs w:val="14"/>
+              </w:rPr>
+            </w:pPr>
+            <w:r>
+              <w:rPr>
+                <w:color w:val="000000" w:themeColor="text1"/>
+                <w:sz w:val="14"/>
+                <w:szCs w:val="14"/>
+                <w:rFonts w:ascii="Times New Roman" w:hAnsi="Times New Roman" w:cs="Times New Roman"/>
+              </w:rPr>
+              <w:t w:space="preserve" xml:space="preserve">N/A</w:t>
+            </w:r>
+            <w:r>
+              <w:rPr>
+                <w:color w:val="000000" w:themeColor="text1"/>
+                <w:sz w:val="14"/>
+                <w:szCs w:val="14"/>
+                <w:rFonts w:ascii="Times New Roman" w:hAnsi="Times New Roman" w:cs="Times New Roman"/>
+              </w:rPr>
+              <w:t/>
+            </w:r>
+            <w:r>
+              <w:rPr>
+                <w:color w:val="000000" w:themeColor="text1"/>
+                <w:sz w:val="14"/>
+                <w:szCs w:val="14"/>
+                <w:rFonts w:ascii="Times New Roman" w:hAnsi="Times New Roman" w:cs="Times New Roman"/>
+              </w:rPr>
+              <w:t xml:space="preserve"/>
+            </w:r>
+          </w:p>
+        </w:tc>
+        <w:tc>
+          <w:tcPr>
+            <w:tcW w:w="507" w:type="dxa"/>
+            <w:gridSpan w:val="2"/>
+            <w:tcBorders>
+              <w:top w:val="single" w:sz="8" w:space="0" w:color="auto"/>
+              <w:left w:val="single" w:sz="8" w:space="0" w:color="auto"/>
+              <w:bottom w:val="single" w:sz="8" w:space="0" w:color="auto"/>
+              <w:right w:val="single" w:sz="8" w:space="0" w:color="auto"/>
+            </w:tcBorders>
+            <w:shd w:val="clear" w:color="auto" w:fill="FFFFFF" w:themeFill="background1"/>
+            <w:tcMar>
+              <w:left w:w="108" w:type="dxa"/>
+              <w:right w:w="108" w:type="dxa"/>
+            </w:tcMar>
+            <w:vAlign w:val="center"/>
+          </w:tcPr>
+          <w:p>
+            <w:pPr>
+              <w:jc w:val="center"/>
+              <w:spacing w:before="0" w:after="0" w:line="240" w:lineRule="auto"/>
+              <w:rPr>
+                <w:rFonts w:ascii="Times New Roman" w:hAnsi="Times New Roman"/>
+                <w:sz w:val="14"/>
+                <w:szCs w:val="14"/>
+              </w:rPr>
+            </w:pPr>
+            <w:r>
+              <w:rPr>
+                <w:sz w:val="14"/>
+                <w:szCs w:val="14"/>
+                <w:rFonts w:ascii="Times New Roman" w:hAnsi="Times New Roman" w:cs="Times New Roman"/>
+              </w:rPr>
+              <w:t>None</w:t>
+            </w:r>
+          </w:p>
+        </w:tc>
+      </w:tr>
+      <w:tr>
+        <w:trPr>
+          <w:trHeight w:val="300"/>
+          <w:trHeight w:val="220" w:hRule="atLeast"/>
+        </w:trPr>
+        <w:tc>
+          <w:tcPr>
+            <w:tcW w:w="837" w:type="dxa"/>
+            <w:tcBorders>
+              <w:top w:val="single" w:sz="8" w:space="0" w:color="auto"/>
+              <w:left w:val="single" w:sz="8" w:space="0" w:color="auto"/>
+              <w:bottom w:val="single" w:sz="8" w:space="0" w:color="auto"/>
+              <w:right w:val="single" w:sz="8" w:space="0" w:color="auto"/>
+            </w:tcBorders>
+            <w:shd w:val="clear" w:color="auto" w:fill="FFFFFF" w:themeFill="background1"/>
+            <w:tcMar>
+              <w:left w:w="108" w:type="dxa"/>
+              <w:right w:w="108" w:type="dxa"/>
+            </w:tcMar>
+            <w:vAlign w:val="center"/>
+          </w:tcPr>
+          <w:p>
+            <w:pPr>
+              <w:jc w:val="center"/>
+            </w:pPr>
+            <w:r>
+              <w:rPr>
+                <w:color w:val="000000" w:themeColor="text1"/>
+                <w:sz w:val="14"/>
+                <w:szCs w:val="14"/>
+                <w:rFonts w:ascii="Times New Roman" w:hAnsi="Times New Roman" w:cs="Times New Roman"/>
+              </w:rPr>
+              <w:t>Settling Sampling of ISO 5 (2 locations)</w:t>
+            </w:r>
+          </w:p>
+        </w:tc>
+        <w:tc>
+          <w:tcPr>
+            <w:tcW w:w="698" w:type="dxa"/>
+            <w:gridSpan w:val="2"/>
+            <w:tcBorders>
+              <w:top w:val="single" w:sz="8" w:space="0" w:color="auto"/>
+              <w:left w:val="single" w:sz="8" w:space="0" w:color="auto"/>
+              <w:bottom w:val="single" w:sz="8" w:space="0" w:color="auto"/>
+              <w:right w:val="single" w:sz="8" w:space="0" w:color="auto"/>
+            </w:tcBorders>
+            <w:shd w:val="clear" w:color="auto" w:fill="FFFFFF" w:themeFill="background1"/>
+            <w:tcMar>
+              <w:left w:w="108" w:type="dxa"/>
+              <w:right w:w="108" w:type="dxa"/>
+            </w:tcMar>
+            <w:vAlign w:val="center"/>
+          </w:tcPr>
+          <w:p>
+            <w:pPr>
+              <w:jc w:val="center"/>
+            </w:pPr>
+            <w:r>
+              <w:rPr>
+                <w:color w:val="000000" w:themeColor="text1"/>
+                <w:sz w:val="14"/>
+                <w:szCs w:val="14"/>
+                <w:rFonts w:ascii="Times New Roman" w:hAnsi="Times New Roman" w:cs="Times New Roman"/>
+              </w:rPr>
+              <w:t xml:space="preserve">Daily</w:t>
+            </w:r>
+          </w:p>
+        </w:tc>
+        <w:tc>
+          <w:tcPr>
+            <w:tcW w:w="1206" w:type="dxa"/>
+            <w:tcBorders>
+              <w:top w:val="single" w:sz="8" w:space="0" w:color="auto"/>
+              <w:left w:val="nil"/>
+              <w:bottom w:val="single" w:sz="8" w:space="0" w:color="auto"/>
+              <w:right w:val="single" w:sz="8" w:space="0" w:color="auto"/>
+            </w:tcBorders>
+            <w:shd w:val="clear" w:color="auto" w:fill="FFFFFF" w:themeFill="background1"/>
+            <w:tcMar>
+              <w:left w:w="108" w:type="dxa"/>
+              <w:right w:w="108" w:type="dxa"/>
+            </w:tcMar>
+            <w:vAlign w:val="center"/>
+          </w:tcPr>
+          <w:p>
+            <w:pPr>
+              <w:jc w:val="center"/>
+              <w:spacing w:before="0" w:after="0" w:line="240" w:lineRule="auto"/>
+              <w:rPr>
+                <w:rFonts w:ascii="Times New Roman" w:hAnsi="Times New Roman"/>
+                <w:sz w:val="14"/>
+                <w:szCs w:val="14"/>
+              </w:rPr>
+            </w:pPr>
+            <w:r>
+              <w:rPr>
+                <w:sz w:val="14"/>
+                <w:szCs w:val="14"/>
+                <w:rFonts w:ascii="Times New Roman" w:hAnsi="Times New Roman" w:cs="Times New Roman"/>
+              </w:rPr>
+              <w:t>16Sep26</w:t>
+            </w:r>
+          </w:p>
+        </w:tc>
+        <w:tc>
+          <w:tcPr>
+            <w:tcW w:w="1168" w:type="dxa"/>
+            <w:gridSpan w:val="2"/>
+            <w:tcBorders>
+              <w:top w:val="single" w:sz="8" w:space="0" w:color="auto"/>
+              <w:left w:val="single" w:sz="8" w:space="0" w:color="auto"/>
+              <w:bottom w:val="single" w:sz="8" w:space="0" w:color="auto"/>
+              <w:right w:val="single" w:sz="8" w:space="0" w:color="auto"/>
+            </w:tcBorders>
+            <w:shd w:val="clear" w:color="auto" w:fill="FFFFFF" w:themeFill="background1"/>
+            <w:tcMar>
+              <w:left w:w="108" w:type="dxa"/>
+              <w:right w:w="108" w:type="dxa"/>
+            </w:tcMar>
+            <w:vAlign w:val="center"/>
+          </w:tcPr>
+          <w:p>
+            <w:pPr>
+              <w:jc w:val="center"/>
+              <w:spacing w:before="0" w:after="0" w:line="240" w:lineRule="auto"/>
+              <w:rPr>
+                <w:rFonts w:ascii="Times New Roman" w:hAnsi="Times New Roman"/>
+                <w:sz w:val="14"/>
+                <w:szCs w:val="14"/>
+              </w:rPr>
+            </w:pPr>
+            <w:r>
+              <w:rPr>
+                <w:sz w:val="14"/>
+                <w:szCs w:val="14"/>
+                <w:rFonts w:ascii="Times New Roman" w:hAnsi="Times New Roman" w:cs="Times New Roman"/>
+              </w:rPr>
+              <w:t>AO</w:t>
+            </w:r>
+          </w:p>
+        </w:tc>
+        <w:tc>
+          <w:tcPr>
+            <w:tcW w:w="581" w:type="dxa"/>
+            <w:tcBorders>
+              <w:top w:val="single" w:sz="8" w:space="0" w:color="auto"/>
+              <w:left w:val="nil"/>
+              <w:bottom w:val="single" w:sz="8" w:space="0" w:color="auto"/>
+              <w:right w:val="single" w:sz="8" w:space="0" w:color="auto"/>
+            </w:tcBorders>
+            <w:shd w:val="clear" w:color="auto" w:fill="FFFFFF" w:themeFill="background1"/>
+            <w:tcMar>
+              <w:left w:w="108" w:type="dxa"/>
+              <w:right w:w="108" w:type="dxa"/>
+            </w:tcMar>
+            <w:vAlign w:val="center"/>
+          </w:tcPr>
+          <w:p>
+            <w:pPr>
+              <w:jc w:val="center"/>
+            </w:pPr>
+            <w:r>
+              <w:rPr>
+                <w:color w:val="000000" w:themeColor="text1"/>
+                <w:sz w:val="14"/>
+                <w:szCs w:val="14"/>
+                <w:rFonts w:ascii="Times New Roman" w:hAnsi="Times New Roman" w:cs="Times New Roman"/>
+              </w:rPr>
+              <w:t xml:space="preserve">Date After Testing</w:t>
+            </w:r>
+          </w:p>
+        </w:tc>
+        <w:tc>
+          <w:tcPr>
+            <w:tcW w:w="1505" w:type="dxa"/>
+            <w:gridSpan w:val="2"/>
+            <w:tcBorders>
+              <w:top w:val="single" w:sz="8" w:space="0" w:color="auto"/>
+              <w:left w:val="single" w:sz="8" w:space="0" w:color="auto"/>
+              <w:bottom w:val="single" w:sz="8" w:space="0" w:color="auto"/>
+              <w:right w:val="single" w:sz="8" w:space="0" w:color="auto"/>
+            </w:tcBorders>
+            <w:shd w:val="clear" w:color="auto" w:fill="FFFFFF" w:themeFill="background1"/>
+            <w:tcMar>
+              <w:left w:w="108" w:type="dxa"/>
+              <w:right w:w="108" w:type="dxa"/>
+            </w:tcMar>
+            <w:vAlign w:val="center"/>
+          </w:tcPr>
+          <w:p>
+            <w:pPr>
+              <w:jc w:val="center"/>
+              <w:spacing w:before="0" w:after="0" w:line="240" w:lineRule="auto"/>
+              <w:rPr>
+                <w:rFonts w:ascii="Times New Roman" w:hAnsi="Times New Roman"/>
+                <w:sz w:val="14"/>
+                <w:szCs w:val="14"/>
+              </w:rPr>
+            </w:pPr>
+            <w:r>
+              <w:rPr>
+                <w:sz w:val="14"/>
+                <w:szCs w:val="14"/>
+                <w:rFonts w:ascii="Times New Roman" w:hAnsi="Times New Roman" w:cs="Times New Roman"/>
+              </w:rPr>
+              <w:t>No growth</w:t>
+            </w:r>
+          </w:p>
+        </w:tc>
+        <w:tc>
+          <w:tcPr>
+            <w:tcW w:w="1444" w:type="dxa"/>
+            <w:tcBorders>
+              <w:top w:val="single" w:sz="8" w:space="0" w:color="auto"/>
+              <w:left w:val="nil"/>
+              <w:bottom w:val="single" w:sz="8" w:space="0" w:color="auto"/>
+              <w:right w:val="single" w:sz="8" w:space="0" w:color="auto"/>
+            </w:tcBorders>
+            <w:shd w:val="clear" w:color="auto" w:fill="FFFFFF" w:themeFill="background1"/>
+            <w:tcMar>
+              <w:left w:w="108" w:type="dxa"/>
+              <w:right w:w="108" w:type="dxa"/>
+            </w:tcMar>
+            <w:vAlign w:val="center"/>
+          </w:tcPr>
+          <w:p>
+            <w:pPr>
+              <w:jc w:val="center"/>
+              <w:spacing w:before="0" w:after="0" w:line="240" w:lineRule="auto"/>
+              <w:rPr>
+                <w:rFonts w:ascii="Times New Roman" w:hAnsi="Times New Roman"/>
+                <w:sz w:val="14"/>
+                <w:szCs w:val="14"/>
+              </w:rPr>
+            </w:pPr>
+            <w:r>
+              <w:rPr>
+                <w:sz w:val="14"/>
+                <w:szCs w:val="14"/>
+                <w:rFonts w:ascii="Times New Roman" w:hAnsi="Times New Roman" w:cs="Times New Roman"/>
+              </w:rPr>
+              <w:t>N/A</w:t>
+            </w:r>
+          </w:p>
+        </w:tc>
+        <w:tc>
+          <w:tcPr>
+            <w:tcW w:w="1394" w:type="dxa"/>
+            <w:tcBorders>
+              <w:top w:val="single" w:sz="8" w:space="0" w:color="auto"/>
+              <w:left w:val="single" w:sz="8" w:space="0" w:color="auto"/>
+              <w:bottom w:val="single" w:sz="8" w:space="0" w:color="auto"/>
+              <w:right w:val="single" w:sz="8" w:space="0" w:color="auto"/>
+            </w:tcBorders>
+            <w:shd w:val="clear" w:color="auto" w:fill="FFFFFF" w:themeFill="background1"/>
+            <w:tcMar>
+              <w:left w:w="108" w:type="dxa"/>
+              <w:right w:w="108" w:type="dxa"/>
+            </w:tcMar>
+            <w:vAlign w:val="center"/>
+          </w:tcPr>
+          <w:p>
+            <w:r>
+              <w:rPr>
+                <w:color w:val="000000" w:themeColor="text1"/>
+                <w:sz w:val="14"/>
+                <w:szCs w:val="14"/>
+                <w:rFonts w:ascii="Times New Roman" w:hAnsi="Times New Roman" w:cs="Times New Roman"/>
+              </w:rPr>
+              <w:t xml:space="preserve" w:space="preserve">N/A</w:t>
+            </w:r>
+            <w:r>
+              <w:rPr>
+                <w:color w:val="000000" w:themeColor="text1"/>
+                <w:sz w:val="14"/>
+                <w:szCs w:val="14"/>
+                <w:lang w:eastAsia="zh-CN"/>
+                <w:rFonts w:ascii="Times New Roman" w:hAnsi="Times New Roman" w:cs="Times New Roman"/>
+              </w:rPr>
+              <w:t/>
+            </w:r>
+            <w:r>
+              <w:rPr>
+                <w:color w:val="000000" w:themeColor="text1"/>
+                <w:sz w:val="14"/>
+                <w:szCs w:val="14"/>
+                <w:rFonts w:ascii="Times New Roman" w:hAnsi="Times New Roman" w:cs="Times New Roman"/>
+              </w:rPr>
+              <w:t/>
+            </w:r>
+            <w:r>
+              <w:rPr>
+                <w:color w:val="000000" w:themeColor="text1"/>
+                <w:sz w:val="14"/>
+                <w:szCs w:val="14"/>
+                <w:rFonts w:ascii="Times New Roman" w:hAnsi="Times New Roman" w:cs="Times New Roman"/>
+              </w:rPr>
+              <w:t/>
+            </w:r>
+            <w:r>
+              <w:rPr>
+                <w:color w:val="000000" w:themeColor="text1"/>
+                <w:sz w:val="14"/>
+                <w:szCs w:val="14"/>
+                <w:rFonts w:ascii="Times New Roman" w:hAnsi="Times New Roman" w:cs="Times New Roman"/>
+              </w:rPr>
+              <w:t xml:space="preserve"/>
+            </w:r>
+          </w:p>
+        </w:tc>
+        <w:tc>
+          <w:tcPr>
+            <w:tcW w:w="507" w:type="dxa"/>
+            <w:gridSpan w:val="2"/>
+            <w:tcBorders>
+              <w:top w:val="single" w:sz="8" w:space="0" w:color="auto"/>
+              <w:left w:val="single" w:sz="8" w:space="0" w:color="auto"/>
+              <w:bottom w:val="single" w:sz="8" w:space="0" w:color="auto"/>
+              <w:right w:val="single" w:sz="8" w:space="0" w:color="auto"/>
+            </w:tcBorders>
+            <w:shd w:val="clear" w:color="auto" w:fill="FFFFFF" w:themeFill="background1"/>
+            <w:tcMar>
+              <w:left w:w="108" w:type="dxa"/>
+              <w:right w:w="108" w:type="dxa"/>
+            </w:tcMar>
+            <w:vAlign w:val="center"/>
+          </w:tcPr>
+          <w:p>
+            <w:pPr>
+              <w:jc w:val="center"/>
+              <w:spacing w:before="0" w:after="0" w:line="240" w:lineRule="auto"/>
+              <w:rPr>
+                <w:rFonts w:ascii="Times New Roman" w:hAnsi="Times New Roman"/>
+                <w:sz w:val="14"/>
+                <w:szCs w:val="14"/>
+              </w:rPr>
+            </w:pPr>
+            <w:r>
+              <w:rPr>
+                <w:sz w:val="14"/>
+                <w:szCs w:val="14"/>
+                <w:rFonts w:ascii="Times New Roman" w:hAnsi="Times New Roman" w:cs="Times New Roman"/>
+              </w:rPr>
+              <w:t>None</w:t>
+            </w:r>
+          </w:p>
+        </w:tc>
+      </w:tr>
+      <w:tr>
+        <w:trPr>
+          <w:trHeight w:val="300"/>
+          <w:trHeight w:val="220" w:hRule="atLeast"/>
+        </w:trPr>
+        <w:tc>
+          <w:tcPr>
+            <w:tcW w:w="9340" w:type="dxa"/>
+            <w:gridSpan w:val="13"/>
+            <w:tcBorders>
+              <w:top w:val="single" w:sz="8" w:space="0" w:color="auto"/>
+              <w:left w:val="single" w:sz="8" w:space="0" w:color="auto"/>
+              <w:bottom w:val="single" w:sz="8" w:space="0" w:color="auto"/>
+              <w:right w:val="single" w:sz="8" w:space="0" w:color="000000" w:themeColor="text1"/>
+            </w:tcBorders>
+            <w:shd w:val="clear" w:color="auto" w:fill="D9D9D9" w:themeFill="background1" w:themeFillShade="D9"/>
+            <w:vAlign w:val="center"/>
+          </w:tcPr>
+          <w:p>
+            <w:r>
+              <w:rPr>
+                <w:b/>
+                <w:bCs/>
+                <w:color w:val="000000" w:themeColor="text1"/>
+                <w:sz w:val="14"/>
+                <w:szCs w:val="14"/>
+                <w:rFonts w:ascii="Times New Roman" w:hAnsi="Times New Roman" w:cs="Times New Roman"/>
+              </w:rPr>
+              <w:t xml:space="preserve">   Weekly Active Air Sampling Bracketing</w:t>
+            </w:r>
+          </w:p>
+        </w:tc>
+      </w:tr>
+      <w:tr>
+        <w:trPr>
+          <w:trHeight w:val="300"/>
+          <w:trHeight w:val="220" w:hRule="atLeast"/>
+        </w:trPr>
+        <w:tc>
+          <w:tcPr>
+            <w:tcW w:w="969" w:type="dxa"/>
+            <w:gridSpan w:val="2"/>
+            <w:tcBorders>
+              <w:top w:val="single" w:sz="8" w:space="0" w:color="auto"/>
+              <w:left w:val="single" w:sz="8" w:space="0" w:color="auto"/>
+              <w:bottom w:val="single" w:sz="8" w:space="0" w:color="auto"/>
+              <w:right w:val="single" w:sz="8" w:space="0" w:color="auto"/>
+            </w:tcBorders>
+            <w:vAlign w:val="center"/>
+          </w:tcPr>
+          <w:p>
+            <w:pPr>
+              <w:jc w:val="center"/>
+            </w:pPr>
+            <w:r>
+              <w:rPr>
+                <w:color w:val="000000" w:themeColor="text1"/>
+                <w:sz w:val="14"/>
+                <w:szCs w:val="14"/>
+                <w:rFonts w:ascii="Times New Roman" w:hAnsi="Times New Roman" w:cs="Times New Roman"/>
+              </w:rPr>
+              <w:t>Active Air Sampling of Cleanrooms</w:t>
+            </w:r>
+          </w:p>
+        </w:tc>
+        <w:tc>
+          <w:tcPr>
+            <w:tcW w:w="566" w:type="dxa"/>
+            <w:tcBorders>
+              <w:top w:val="single" w:sz="8" w:space="0" w:color="auto"/>
+              <w:left w:val="nil"/>
+              <w:bottom w:val="single" w:sz="8" w:space="0" w:color="auto"/>
+              <w:right w:val="single" w:sz="8" w:space="0" w:color="auto"/>
+            </w:tcBorders>
+            <w:vAlign w:val="center"/>
+          </w:tcPr>
+          <w:p>
+            <w:pPr>
+              <w:jc w:val="center"/>
+            </w:pPr>
+            <w:r>
+              <w:rPr>
+                <w:color w:val="000000" w:themeColor="text1"/>
+                <w:sz w:val="14"/>
+                <w:szCs w:val="14"/>
+                <w:rFonts w:ascii="Times New Roman" w:hAnsi="Times New Roman" w:cs="Times New Roman"/>
+              </w:rPr>
+              <w:t xml:space="preserve">Weekly</w:t>
+            </w:r>
+          </w:p>
+        </w:tc>
+        <w:tc>
+          <w:tcPr>
+            <w:tcW w:w="1206" w:type="dxa"/>
+            <w:tcBorders>
+              <w:top w:val="single" w:sz="8" w:space="0" w:color="auto"/>
+              <w:left w:val="single" w:sz="8" w:space="0" w:color="auto"/>
+              <w:bottom w:val="single" w:sz="8" w:space="0" w:color="auto"/>
+              <w:right w:val="single" w:sz="8" w:space="0" w:color="auto"/>
+            </w:tcBorders>
+            <w:vAlign w:val="center"/>
+          </w:tcPr>
+          <w:p>
+            <w:pPr>
+              <w:jc w:val="center"/>
+              <w:spacing w:before="0" w:after="0" w:line="240" w:lineRule="auto"/>
+              <w:rPr>
+                <w:rFonts w:ascii="Times New Roman" w:hAnsi="Times New Roman"/>
+                <w:sz w:val="14"/>
+                <w:szCs w:val="14"/>
+              </w:rPr>
+            </w:pPr>
+            <w:r>
+              <w:rPr>
+                <w:sz w:val="14"/>
+                <w:szCs w:val="14"/>
+                <w:rFonts w:ascii="Times New Roman" w:hAnsi="Times New Roman" w:cs="Times New Roman"/>
+              </w:rPr>
+              <w:t>10Sep26</w:t>
+            </w:r>
+          </w:p>
+        </w:tc>
+        <w:tc>
+          <w:tcPr>
+            <w:tcW w:w="1049" w:type="dxa"/>
+            <w:tcBorders>
+              <w:top w:val="single" w:sz="8" w:space="0" w:color="auto"/>
+              <w:left w:val="single" w:sz="8" w:space="0" w:color="auto"/>
+              <w:bottom w:val="single" w:sz="8" w:space="0" w:color="auto"/>
+              <w:right w:val="single" w:sz="8" w:space="0" w:color="auto"/>
+            </w:tcBorders>
+            <w:vAlign w:val="center"/>
+          </w:tcPr>
+          <w:p>
+            <w:pPr>
+              <w:jc w:val="center"/>
+              <w:spacing w:before="0" w:after="0" w:line="240" w:lineRule="auto"/>
+              <w:rPr>
+                <w:rFonts w:ascii="Times New Roman" w:hAnsi="Times New Roman"/>
+                <w:sz w:val="14"/>
+                <w:szCs w:val="14"/>
+              </w:rPr>
+            </w:pPr>
+            <w:r>
+              <w:rPr>
+                <w:sz w:val="14"/>
+                <w:szCs w:val="14"/>
+                <w:rFonts w:ascii="Times New Roman" w:hAnsi="Times New Roman" w:cs="Times New Roman"/>
+              </w:rPr>
+              <w:t>SMO</w:t>
+            </w:r>
+          </w:p>
+        </w:tc>
+        <w:tc>
+          <w:tcPr>
+            <w:tcW w:w="786" w:type="dxa"/>
+            <w:gridSpan w:val="3"/>
+            <w:tcBorders>
+              <w:top w:val="single" w:sz="8" w:space="0" w:color="auto"/>
+              <w:left w:val="single" w:sz="8" w:space="0" w:color="auto"/>
+              <w:bottom w:val="single" w:sz="8" w:space="0" w:color="auto"/>
+              <w:right w:val="single" w:sz="8" w:space="0" w:color="auto"/>
+            </w:tcBorders>
+            <w:vAlign w:val="center"/>
+          </w:tcPr>
+          <w:p>
+            <w:pPr>
+              <w:jc w:val="center"/>
+            </w:pPr>
+            <w:r>
+              <w:rPr>
+                <w:color w:val="000000" w:themeColor="text1"/>
+                <w:sz w:val="14"/>
+                <w:szCs w:val="14"/>
+                <w:rFonts w:ascii="Times New Roman" w:hAnsi="Times New Roman" w:cs="Times New Roman"/>
+              </w:rPr>
+              <w:t xml:space="preserve">Week on Testing Date</w:t>
+            </w:r>
+          </w:p>
+        </w:tc>
+        <w:tc>
+          <w:tcPr>
+            <w:tcW w:w="1419" w:type="dxa"/>
+            <w:tcBorders>
+              <w:top w:val="single" w:sz="8" w:space="0" w:color="auto"/>
+              <w:left w:val="nil"/>
+              <w:bottom w:val="single" w:sz="8" w:space="0" w:color="auto"/>
+              <w:right w:val="single" w:sz="8" w:space="0" w:color="auto"/>
+            </w:tcBorders>
+            <w:vAlign w:val="center"/>
+          </w:tcPr>
+          <w:p>
+            <w:pPr>
+              <w:jc w:val="center"/>
+              <w:spacing w:before="0" w:after="0" w:line="240" w:lineRule="auto"/>
+              <w:rPr>
+                <w:rFonts w:ascii="Times New Roman" w:hAnsi="Times New Roman"/>
+                <w:sz w:val="14"/>
+                <w:szCs w:val="14"/>
+              </w:rPr>
+            </w:pPr>
+            <w:r>
+              <w:rPr>
+                <w:sz w:val="14"/>
+                <w:szCs w:val="14"/>
+                <w:rFonts w:ascii="Times New Roman" w:hAnsi="Times New Roman" w:cs="Times New Roman"/>
+              </w:rPr>
+              <w:t>1 CFU (ISO 8 114)</w:t>
+            </w:r>
+          </w:p>
+        </w:tc>
+        <w:tc>
+          <w:tcPr>
+            <w:tcW w:w="1444" w:type="dxa"/>
+            <w:tcBorders>
+              <w:top w:val="single" w:sz="8" w:space="0" w:color="auto"/>
+              <w:left w:val="single" w:sz="8" w:space="0" w:color="auto"/>
+              <w:bottom w:val="single" w:sz="8" w:space="0" w:color="auto"/>
+              <w:right w:val="single" w:sz="8" w:space="0" w:color="auto"/>
+            </w:tcBorders>
+            <w:vAlign w:val="center"/>
+          </w:tcPr>
+          <w:p>
+            <w:pPr>
+              <w:jc w:val="center"/>
+              <w:spacing w:before="0" w:after="0" w:line="240" w:lineRule="auto"/>
+              <w:rPr>
+                <w:rFonts w:ascii="Times New Roman" w:hAnsi="Times New Roman"/>
+                <w:sz w:val="14"/>
+                <w:szCs w:val="14"/>
+              </w:rPr>
+            </w:pPr>
+            <w:hyperlink r:id="rId12" w:history="1">
+              <w:r>
+                <w:rPr>
+                  <w:rFonts w:ascii="Times New Roman" w:hAnsi="Times New Roman"/>
+                  <w:color w:val="0000FF"/>
+                  <w:sz w:val="14"/>
+                  <w:szCs w:val="14"/>
+                  <w:u w:val="single"/>
+                </w:rPr>
+                <w:t>ETX-260921-0520</w:t>
+              </w:r>
+            </w:hyperlink>
+          </w:p>
+        </w:tc>
+        <w:tc>
+          <w:tcPr>
+            <w:tcW w:w="1441" w:type="dxa"/>
+            <w:gridSpan w:val="2"/>
+            <w:tcBorders>
+              <w:top w:val="single" w:sz="8" w:space="0" w:color="auto"/>
+              <w:left w:val="single" w:sz="8" w:space="0" w:color="auto"/>
+              <w:bottom w:val="single" w:sz="8" w:space="0" w:color="auto"/>
+              <w:right w:val="single" w:sz="8" w:space="0" w:color="auto"/>
+            </w:tcBorders>
+            <w:vAlign w:val="center"/>
+          </w:tcPr>
+          <w:p>
+            <w:pPr>
+              <w:jc w:val="center"/>
+              <w:spacing w:before="0" w:after="0" w:line="240" w:lineRule="auto"/>
+              <w:rPr>
+                <w:rFonts w:ascii="Times New Roman" w:hAnsi="Times New Roman"/>
+                <w:sz w:val="13"/>
+                <w:szCs w:val="13"/>
+              </w:rPr>
+            </w:pPr>
+            <w:r>
+              <w:rPr>
+                <w:i/>
+                <w:iCs/>
+                <w:sz w:val="13"/>
+                <w:szCs w:val="13"/>
+                <w:rFonts w:ascii="Times New Roman" w:hAnsi="Times New Roman" w:cs="Times New Roman"/>
+              </w:rPr>
+              <w:t>Micrococcus luteus</w:t>
+            </w:r>
+            <w:r>
+              <w:rPr>
+                <w:sz w:val="13"/>
+                <w:szCs w:val="13"/>
+                <w:rFonts w:ascii="Times New Roman" w:hAnsi="Times New Roman" w:cs="Times New Roman"/>
+              </w:rPr>
+              <w:br/>
+              <w:t>(Gram (+) cocci)</w:t>
+            </w:r>
+          </w:p>
+        </w:tc>
+        <w:tc>
+          <w:tcPr>
+            <w:tcW w:w="460" w:type="dxa"/>
+            <w:tcBorders>
+              <w:top w:val="single" w:sz="8" w:space="0" w:color="auto"/>
+              <w:left w:val="nil"/>
+              <w:bottom w:val="single" w:sz="8" w:space="0" w:color="auto"/>
+              <w:right w:val="single" w:sz="8" w:space="0" w:color="auto"/>
+            </w:tcBorders>
+            <w:vAlign w:val="center"/>
+          </w:tcPr>
+          <w:p>
+            <w:pPr>
+              <w:jc w:val="center"/>
+              <w:rPr>
+                <w:rFonts w:ascii="Times New Roman" w:hAnsi="Times New Roman"/>
+                <w:sz w:val="14"/>
+                <w:szCs w:val="14"/>
+              </w:rPr>
+            </w:pPr>
+            <w:r>
+              <w:rPr>
+                <w:sz w:val="14"/>
+                <w:szCs w:val="14"/>
+                <w:rFonts w:ascii="Times New Roman" w:hAnsi="Times New Roman" w:cs="Times New Roman"/>
+              </w:rPr>
+              <w:t xml:space="preserve">None </w:t>
+            </w:r>
+          </w:p>
+        </w:tc>
+      </w:tr>
+      <w:tr>
+        <w:trPr>
+          <w:trHeight w:val="300"/>
+          <w:trHeight w:val="220" w:hRule="atLeast"/>
+        </w:trPr>
+        <w:tc>
+          <w:tcPr>
+            <w:tcW w:w="9340" w:type="dxa"/>
+            <w:gridSpan w:val="13"/>
+            <w:tcBorders>
+              <w:top w:val="single" w:sz="8" w:space="0" w:color="auto"/>
+              <w:left w:val="single" w:sz="8" w:space="0" w:color="auto"/>
+              <w:bottom w:val="single" w:sz="8" w:space="0" w:color="auto"/>
+              <w:right w:val="single" w:sz="8" w:space="0" w:color="000000" w:themeColor="text1"/>
+            </w:tcBorders>
+            <w:shd w:val="clear" w:color="auto" w:fill="D9D9D9" w:themeFill="background1" w:themeFillShade="D9"/>
+            <w:vAlign w:val="center"/>
+          </w:tcPr>
+          <w:p>
+            <w:r>
+              <w:rPr>
+                <w:b/>
+                <w:bCs/>
+                <w:color w:val="000000" w:themeColor="text1"/>
+                <w:sz w:val="14"/>
+                <w:szCs w:val="14"/>
+                <w:rFonts w:ascii="Times New Roman" w:hAnsi="Times New Roman" w:cs="Times New Roman"/>
+              </w:rPr>
+              <w:t xml:space="preserve">   Surface Sampling of Anteroom and Cleanroom Bracketing </w:t>
+            </w:r>
+          </w:p>
+        </w:tc>
+      </w:tr>
+      <w:tr>
+        <w:trPr>
+          <w:trHeight w:val="255"/>
+          <w:trHeight w:val="220" w:hRule="atLeast"/>
+        </w:trPr>
+        <w:tc>
+          <w:tcPr>
+            <w:tcW w:w="969" w:type="dxa"/>
+            <w:gridSpan w:val="2"/>
+            <w:tcBorders>
+              <w:top w:val="single" w:sz="8" w:space="0" w:color="auto"/>
+              <w:left w:val="single" w:sz="8" w:space="0" w:color="auto"/>
+              <w:bottom w:val="single" w:sz="8" w:space="0" w:color="auto"/>
+              <w:right w:val="single" w:sz="8" w:space="0" w:color="auto"/>
+            </w:tcBorders>
+            <w:vAlign w:val="center"/>
+          </w:tcPr>
+          <w:p>
+            <w:pPr>
+              <w:jc w:val="center"/>
+            </w:pPr>
+            <w:r>
+              <w:rPr>
+                <w:color w:val="000000" w:themeColor="text1"/>
+                <w:sz w:val="14"/>
+                <w:szCs w:val="14"/>
+                <w:rFonts w:ascii="Times New Roman" w:hAnsi="Times New Roman" w:cs="Times New Roman"/>
+              </w:rPr>
+              <w:t>Surface Sampling of Cleanrooms</w:t>
+            </w:r>
+          </w:p>
+        </w:tc>
+        <w:tc>
+          <w:tcPr>
+            <w:tcW w:w="566" w:type="dxa"/>
+            <w:tcBorders>
+              <w:top w:val="single" w:sz="8" w:space="0" w:color="auto"/>
+              <w:left w:val="nil"/>
+              <w:bottom w:val="single" w:sz="8" w:space="0" w:color="auto"/>
+              <w:right w:val="single" w:sz="8" w:space="0" w:color="auto"/>
+            </w:tcBorders>
+            <w:vAlign w:val="center"/>
+          </w:tcPr>
+          <w:p>
+            <w:pPr>
+              <w:jc w:val="center"/>
+            </w:pPr>
+            <w:r>
+              <w:rPr>
+                <w:color w:val="000000" w:themeColor="text1"/>
+                <w:sz w:val="14"/>
+                <w:szCs w:val="14"/>
+                <w:rFonts w:ascii="Times New Roman" w:hAnsi="Times New Roman" w:cs="Times New Roman"/>
+              </w:rPr>
+              <w:t xml:space="preserve">Weekly</w:t>
+            </w:r>
+          </w:p>
+        </w:tc>
+        <w:tc>
+          <w:tcPr>
+            <w:tcW w:w="1206" w:type="dxa"/>
+            <w:tcBorders>
+              <w:top w:val="single" w:sz="8" w:space="0" w:color="auto"/>
+              <w:left w:val="single" w:sz="8" w:space="0" w:color="auto"/>
+              <w:bottom w:val="single" w:sz="8" w:space="0" w:color="auto"/>
+              <w:right w:val="single" w:sz="8" w:space="0" w:color="auto"/>
+            </w:tcBorders>
+            <w:vAlign w:val="center"/>
+          </w:tcPr>
+          <w:p>
+            <w:pPr>
+              <w:jc w:val="center"/>
+              <w:spacing w:before="0" w:after="0" w:line="240" w:lineRule="auto"/>
+              <w:rPr>
+                <w:rFonts w:ascii="Times New Roman" w:hAnsi="Times New Roman"/>
+                <w:sz w:val="14"/>
+                <w:szCs w:val="14"/>
+              </w:rPr>
+            </w:pPr>
+            <w:r>
+              <w:rPr>
+                <w:sz w:val="14"/>
+                <w:szCs w:val="14"/>
+                <w:rFonts w:ascii="Times New Roman" w:hAnsi="Times New Roman" w:cs="Times New Roman"/>
+              </w:rPr>
+              <w:t>10Sep26</w:t>
+            </w:r>
+          </w:p>
+        </w:tc>
+        <w:tc>
+          <w:tcPr>
+            <w:tcW w:w="1049" w:type="dxa"/>
+            <w:tcBorders>
+              <w:top w:val="single" w:sz="8" w:space="0" w:color="auto"/>
+              <w:left w:val="single" w:sz="8" w:space="0" w:color="auto"/>
+              <w:bottom w:val="single" w:sz="8" w:space="0" w:color="auto"/>
+              <w:right w:val="single" w:sz="8" w:space="0" w:color="auto"/>
+            </w:tcBorders>
+            <w:vAlign w:val="center"/>
+          </w:tcPr>
+          <w:p>
+            <w:pPr>
+              <w:jc w:val="center"/>
+              <w:spacing w:before="0" w:after="0" w:line="240" w:lineRule="auto"/>
+              <w:rPr>
+                <w:rFonts w:ascii="Times New Roman" w:hAnsi="Times New Roman"/>
+                <w:sz w:val="14"/>
+                <w:szCs w:val="14"/>
+              </w:rPr>
+            </w:pPr>
+            <w:r>
+              <w:rPr>
+                <w:sz w:val="14"/>
+                <w:szCs w:val="14"/>
+                <w:rFonts w:ascii="Times New Roman" w:hAnsi="Times New Roman" w:cs="Times New Roman"/>
+              </w:rPr>
+              <w:t>SMO</w:t>
+            </w:r>
+          </w:p>
+        </w:tc>
+        <w:tc>
+          <w:tcPr>
+            <w:tcW w:w="786" w:type="dxa"/>
+            <w:gridSpan w:val="3"/>
+            <w:tcBorders>
+              <w:top w:val="single" w:sz="8" w:space="0" w:color="auto"/>
+              <w:left w:val="single" w:sz="8" w:space="0" w:color="auto"/>
+              <w:bottom w:val="single" w:sz="8" w:space="0" w:color="auto"/>
+              <w:right w:val="single" w:sz="8" w:space="0" w:color="auto"/>
+            </w:tcBorders>
+            <w:vAlign w:val="center"/>
+          </w:tcPr>
+          <w:p>
+            <w:pPr>
+              <w:jc w:val="center"/>
+            </w:pPr>
+            <w:r>
+              <w:rPr>
+                <w:color w:val="000000" w:themeColor="text1"/>
+                <w:sz w:val="14"/>
+                <w:szCs w:val="14"/>
+                <w:rFonts w:ascii="Times New Roman" w:hAnsi="Times New Roman" w:cs="Times New Roman"/>
+              </w:rPr>
+              <w:t xml:space="preserve">Week on Testing Date</w:t>
+            </w:r>
+          </w:p>
+        </w:tc>
+        <w:tc>
+          <w:tcPr>
+            <w:tcW w:w="1419" w:type="dxa"/>
+            <w:tcBorders>
+              <w:top w:val="single" w:sz="8" w:space="0" w:color="auto"/>
+              <w:left w:val="nil"/>
+              <w:bottom w:val="single" w:sz="8" w:space="0" w:color="auto"/>
+              <w:right w:val="single" w:sz="8" w:space="0" w:color="auto"/>
+            </w:tcBorders>
+            <w:vAlign w:val="center"/>
+          </w:tcPr>
+          <w:p>
+            <w:pPr>
+              <w:jc w:val="center"/>
+              <w:spacing w:before="0" w:after="0" w:line="240" w:lineRule="auto"/>
+              <w:rPr>
+                <w:rFonts w:ascii="Times New Roman" w:hAnsi="Times New Roman"/>
+                <w:sz w:val="14"/>
+                <w:szCs w:val="14"/>
+              </w:rPr>
+            </w:pPr>
+            <w:r>
+              <w:rPr>
+                <w:sz w:val="14"/>
+                <w:szCs w:val="14"/>
+                <w:rFonts w:ascii="Times New Roman" w:hAnsi="Times New Roman" w:cs="Times New Roman"/>
+              </w:rPr>
+              <w:t>No growth</w:t>
+            </w:r>
+          </w:p>
+        </w:tc>
+        <w:tc>
+          <w:tcPr>
+            <w:tcW w:w="1444" w:type="dxa"/>
+            <w:tcBorders>
+              <w:top w:val="single" w:sz="8" w:space="0" w:color="auto"/>
+              <w:left w:val="single" w:sz="8" w:space="0" w:color="auto"/>
+              <w:bottom w:val="single" w:sz="8" w:space="0" w:color="auto"/>
+              <w:right w:val="single" w:sz="8" w:space="0" w:color="auto"/>
+            </w:tcBorders>
+            <w:vAlign w:val="center"/>
+          </w:tcPr>
+          <w:p>
+            <w:pPr>
+              <w:jc w:val="center"/>
+              <w:spacing w:before="0" w:after="0" w:line="240" w:lineRule="auto"/>
+              <w:rPr>
+                <w:rFonts w:ascii="Times New Roman" w:hAnsi="Times New Roman"/>
+                <w:sz w:val="14"/>
+                <w:szCs w:val="14"/>
+              </w:rPr>
+            </w:pPr>
+            <w:r>
+              <w:rPr>
+                <w:sz w:val="14"/>
+                <w:szCs w:val="14"/>
+                <w:rFonts w:ascii="Times New Roman" w:hAnsi="Times New Roman" w:cs="Times New Roman"/>
+              </w:rPr>
+              <w:t>N/A</w:t>
+            </w:r>
+          </w:p>
+        </w:tc>
+        <w:tc>
+          <w:tcPr>
+            <w:tcW w:w="1441" w:type="dxa"/>
+            <w:gridSpan w:val="2"/>
+            <w:tcBorders>
+              <w:top w:val="single" w:sz="8" w:space="0" w:color="auto"/>
+              <w:left w:val="single" w:sz="8" w:space="0" w:color="auto"/>
+              <w:bottom w:val="single" w:sz="8" w:space="0" w:color="auto"/>
+              <w:right w:val="single" w:sz="8" w:space="0" w:color="auto"/>
+            </w:tcBorders>
+            <w:vAlign w:val="center"/>
+          </w:tcPr>
+          <w:p>
+            <w:pPr>
+              <w:jc w:val="center"/>
+              <w:spacing w:before="0" w:after="0" w:line="240" w:lineRule="auto"/>
+              <w:rPr>
+                <w:rFonts w:ascii="Times New Roman" w:hAnsi="Times New Roman"/>
+                <w:sz w:val="14"/>
+                <w:szCs w:val="14"/>
+              </w:rPr>
+            </w:pPr>
+            <w:r>
+              <w:rPr>
+                <w:sz w:val="14"/>
+                <w:szCs w:val="14"/>
+                <w:rFonts w:ascii="Times New Roman" w:hAnsi="Times New Roman" w:cs="Times New Roman"/>
+              </w:rPr>
+              <w:t>N/A</w:t>
+            </w:r>
+          </w:p>
+        </w:tc>
+        <w:tc>
+          <w:tcPr>
+            <w:tcW w:w="460" w:type="dxa"/>
+            <w:tcBorders>
+              <w:top w:val="single" w:sz="8" w:space="0" w:color="auto"/>
+              <w:left w:val="nil"/>
+              <w:bottom w:val="single" w:sz="8" w:space="0" w:color="auto"/>
+              <w:right w:val="single" w:sz="8" w:space="0" w:color="auto"/>
+            </w:tcBorders>
+            <w:vAlign w:val="center"/>
+          </w:tcPr>
+          <w:p>
+            <w:pPr>
+              <w:jc w:val="center"/>
+              <w:rPr>
+                <w:rFonts w:ascii="Times New Roman" w:hAnsi="Times New Roman"/>
+                <w:sz w:val="14"/>
+                <w:szCs w:val="14"/>
+              </w:rPr>
+            </w:pPr>
+            <w:r>
+              <w:rPr>
+                <w:sz w:val="14"/>
+                <w:szCs w:val="14"/>
+                <w:rFonts w:ascii="Times New Roman" w:hAnsi="Times New Roman" w:cs="Times New Roman"/>
+              </w:rPr>
+              <w:t>None</w:t>
+            </w:r>
+          </w:p>
+        </w:tc>
+      </w:tr>
+    </w:tbl>
   </w:body>
 </w:document>
 </file>

</xml_diff>